<commit_message>
feat: add date-based letterhead filtering and update docx preview styling
</commit_message>
<xml_diff>
--- a/public/uploads/swakelola/sppg/A. 1. Petikan DIPA dan Revisi Anggaran POK SPPG TA 2025.docx
+++ b/public/uploads/swakelola/sppg/A. 1. Petikan DIPA dan Revisi Anggaran POK SPPG TA 2025.docx
@@ -4,42 +4,47 @@
   <w:body>
     <w:p>
       <w:pPr>
-        <w:spacing w:before="0" w:after="40"/>
+        <w:spacing w:before="0" w:after="200" w:line="240" w:lineRule="auto"/>
         <w:jc w:val="center"/>
       </w:pPr>
       <w:r>
-        <w:rPr>
-          <w:rFonts w:ascii="Arial" w:hAnsi="Arial"/>
-          <w:b/>
-          <w:sz w:val="22"/>
-        </w:rPr>
-        <w:t>KEMENTERIAN PEKERJAAN UMUM</w:t>
-        <w:br/>
-        <w:t>DIREKTORAT JENDERAL PRASARANA STRATEGIS</w:t>
-        <w:br/>
-        <w:t>SATUAN KERJA PELAKSANAAN PRASARANA STRATEGIS RIAU</w:t>
-        <w:br/>
+        <w:drawing>
+          <wp:inline xmlns:a="http://schemas.openxmlformats.org/drawingml/2006/main" xmlns:pic="http://schemas.openxmlformats.org/drawingml/2006/picture">
+            <wp:extent cx="5940000" cy="876504"/>
+            <wp:docPr id="1" name="Picture 1"/>
+            <wp:cNvGraphicFramePr>
+              <a:graphicFrameLocks noChangeAspect="1"/>
+            </wp:cNvGraphicFramePr>
+            <a:graphic>
+              <a:graphicData uri="http://schemas.openxmlformats.org/drawingml/2006/picture">
+                <pic:pic>
+                  <pic:nvPicPr>
+                    <pic:cNvPr id="0" name="1775466518_6770018a33b3f91eebd0.png"/>
+                    <pic:cNvPicPr/>
+                  </pic:nvPicPr>
+                  <pic:blipFill>
+                    <a:blip r:embed="rId9"/>
+                    <a:stretch>
+                      <a:fillRect/>
+                    </a:stretch>
+                  </pic:blipFill>
+                  <pic:spPr>
+                    <a:xfrm>
+                      <a:off x="0" y="0"/>
+                      <a:ext cx="5940000" cy="876504"/>
+                    </a:xfrm>
+                    <a:prstGeom prst="rect"/>
+                  </pic:spPr>
+                </pic:pic>
+              </a:graphicData>
+            </a:graphic>
+          </wp:inline>
+        </w:drawing>
       </w:r>
     </w:p>
     <w:p>
       <w:pPr>
-        <w:spacing w:before="0" w:after="160"/>
-        <w:jc w:val="center"/>
-      </w:pPr>
-      <w:r>
-        <w:rPr>
-          <w:rFonts w:ascii="Arial" w:hAnsi="Arial"/>
-          <w:color w:val="787878"/>
-          <w:sz w:val="17"/>
-        </w:rPr>
-        <w:t>Jalan Bakti, Ruko Komplek Mutiara Asri Garden, Sidomulyo Timur, Marpoyan Damai, Pekanbaru</w:t>
-        <w:br/>
-        <w:t>—————————————————————————————————————————————————————————————————</w:t>
-      </w:r>
-    </w:p>
-    <w:p>
-      <w:pPr>
-        <w:spacing w:before="160" w:after="200"/>
+        <w:spacing w:before="40" w:after="40" w:line="276" w:lineRule="auto"/>
         <w:jc w:val="center"/>
       </w:pPr>
       <w:r>
@@ -49,149 +54,170 @@
           <w:sz w:val="23"/>
         </w:rPr>
         <w:t>PETIKAN RINCIAN KERTAS KERJA SATKER (POK)</w:t>
-        <w:br/>
       </w:r>
+    </w:p>
+    <w:p>
+      <w:pPr>
+        <w:spacing w:before="0" w:after="40" w:line="276" w:lineRule="auto"/>
+        <w:jc w:val="center"/>
+      </w:pPr>
       <w:r>
         <w:rPr>
           <w:rFonts w:ascii="Arial" w:hAnsi="Arial"/>
           <w:b/>
-          <w:sz w:val="23"/>
+          <w:sz w:val="22"/>
         </w:rPr>
         <w:t>TAHUN ANGGARAN 2025</w:t>
-        <w:br/>
       </w:r>
+    </w:p>
+    <w:p>
+      <w:pPr>
+        <w:spacing w:before="0" w:after="40" w:line="276" w:lineRule="auto"/>
+        <w:jc w:val="center"/>
+      </w:pPr>
       <w:r>
         <w:rPr>
           <w:rFonts w:ascii="Arial" w:hAnsi="Arial"/>
           <w:b/>
-          <w:sz w:val="23"/>
+          <w:sz w:val="22"/>
         </w:rPr>
         <w:t>PROGRAM PRASARANA STRATEGIS</w:t>
       </w:r>
     </w:p>
     <w:p>
       <w:pPr>
-        <w:spacing w:before="0" w:after="200"/>
+        <w:spacing w:before="40" w:after="200" w:line="276" w:lineRule="auto"/>
         <w:jc w:val="center"/>
       </w:pPr>
       <w:r>
         <w:rPr>
           <w:rFonts w:ascii="Arial" w:hAnsi="Arial"/>
-          <w:i/>
-          <w:sz w:val="20"/>
+          <w:b/>
+          <w:sz w:val="21"/>
         </w:rPr>
-        <w:t>Dasar: DIPA Petikan Nomor: DIPA-145.06.1.691285/2025 Tanggal 02 Desember 2024</w:t>
+        <w:t>NOMOR : DIPA-145.06.1.691285/2025 (Revisi POK Kegiatan SPPG)</w:t>
       </w:r>
     </w:p>
     <w:p>
+      <w:pPr>
+        <w:spacing w:before="0" w:after="120" w:line="300" w:lineRule="auto"/>
+        <w:jc w:val="both"/>
+      </w:pPr>
       <w:r>
         <w:rPr>
           <w:rFonts w:ascii="Arial" w:hAnsi="Arial"/>
-          <w:sz w:val="20"/>
+          <w:b w:val="0"/>
+          <w:sz w:val="21"/>
         </w:rPr>
-        <w:t>Kementerian / Lembaga : (145) KEMENTERIAN PEKERJAAN UMUM</w:t>
-        <w:br/>
-        <w:t>Unit Organisasi       : (06) DIREKTORAT JENDERAL PRASARANA STRATEGIS</w:t>
-        <w:br/>
-        <w:t>Satuan Kerja          : (691285) SATUAN KERJA PELAKSANAAN PRASARANA STRATEGIS RIAU</w:t>
-        <w:br/>
-        <w:t>Alokasi Total Satker  : Rp 168.538.899.000,-</w:t>
-        <w:br/>
-        <w:t>Alokasi Kegiatan SPPG : Rp 413.000.000,-</w:t>
-        <w:br/>
+        <w:t>Dokumen ini merupakan Petikan Rincian Kertas Kerja Satuan Kerja (POK) Tahun Anggaran 2025 sebagai dasar pengesahan ketersediaan alokasi anggaran untuk pelaksanaan kegiatan Swakelola Tipe I Administrasi Kegiatan Pembangunan Gedung Satuan Pelayanan Pemenuhan Gizi (SPPG) Provinsi Riau.</w:t>
+      </w:r>
+    </w:p>
+    <w:p>
+      <w:pPr>
+        <w:keepNext/>
+        <w:spacing w:before="160" w:after="80"/>
+        <w:jc w:val="left"/>
+      </w:pPr>
+      <w:r>
+        <w:rPr>
+          <w:rFonts w:ascii="Arial" w:hAnsi="Arial"/>
+          <w:b/>
+          <w:sz w:val="21"/>
+        </w:rPr>
+        <w:t>I. IDENTITAS MATA ANGGARAN (DIPA / POK TA 2025)</w:t>
       </w:r>
     </w:p>
     <w:tbl>
       <w:tblPr>
         <w:tblW w:type="auto" w:w="0"/>
         <w:jc w:val="center"/>
+        <w:tblLayout w:type="fixed"/>
         <w:tblLook w:firstColumn="1" w:firstRow="1" w:lastColumn="0" w:lastRow="0" w:noHBand="0" w:noVBand="1" w:val="04A0"/>
+        <w:tblBorders>
+          <w:top w:val="none" w:sz="0" w:space="0" w:color="auto"/>
+          <w:left w:val="none" w:sz="0" w:space="0" w:color="auto"/>
+          <w:bottom w:val="none" w:sz="0" w:space="0" w:color="auto"/>
+          <w:right w:val="none" w:sz="0" w:space="0" w:color="auto"/>
+          <w:insideH w:val="none" w:sz="0" w:space="0" w:color="auto"/>
+          <w:insideV w:val="none" w:sz="0" w:space="0" w:color="auto"/>
+        </w:tblBorders>
       </w:tblPr>
       <w:tblGrid>
-        <w:gridCol w:w="1728"/>
-        <w:gridCol w:w="1728"/>
-        <w:gridCol w:w="1728"/>
-        <w:gridCol w:w="1728"/>
-        <w:gridCol w:w="1728"/>
+        <w:gridCol w:w="3118"/>
+        <w:gridCol w:w="3118"/>
+        <w:gridCol w:w="3118"/>
       </w:tblGrid>
       <w:tr>
         <w:tc>
           <w:tcPr>
-            <w:tcW w:type="dxa" w:w="1728"/>
-            <w:shd w:val="clear" w:color="auto" w:fill="E0E0E0"/>
+            <w:tcW w:type="dxa" w:w="2721"/>
+            <w:tcMar>
+              <w:top w:w="45" w:type="dxa"/>
+              <w:bottom w:w="45" w:type="dxa"/>
+              <w:left w:w="20" w:type="dxa"/>
+              <w:right w:w="20" w:type="dxa"/>
+            </w:tcMar>
           </w:tcPr>
           <w:p>
+            <w:pPr>
+              <w:spacing w:before="0" w:after="20" w:line="276" w:lineRule="auto"/>
+              <w:jc w:val="left"/>
+            </w:pPr>
             <w:r>
               <w:rPr>
                 <w:rFonts w:ascii="Arial" w:hAnsi="Arial"/>
-                <w:b/>
-                <w:sz w:val="18"/>
+                <w:b w:val="0"/>
+                <w:sz w:val="21"/>
               </w:rPr>
-              <w:t>KODE / DETIL</w:t>
+              <w:t>Kementerian / Lembaga</w:t>
             </w:r>
           </w:p>
         </w:tc>
         <w:tc>
           <w:tcPr>
-            <w:tcW w:type="dxa" w:w="1728"/>
-            <w:shd w:val="clear" w:color="auto" w:fill="E0E0E0"/>
+            <w:tcW w:type="dxa" w:w="255"/>
+            <w:tcMar>
+              <w:top w:w="45" w:type="dxa"/>
+              <w:bottom w:w="45" w:type="dxa"/>
+              <w:left w:w="20" w:type="dxa"/>
+              <w:right w:w="20" w:type="dxa"/>
+            </w:tcMar>
           </w:tcPr>
           <w:p>
+            <w:pPr>
+              <w:spacing w:before="0" w:after="20" w:line="276" w:lineRule="auto"/>
+              <w:jc w:val="center"/>
+            </w:pPr>
             <w:r>
               <w:rPr>
                 <w:rFonts w:ascii="Arial" w:hAnsi="Arial"/>
-                <w:b/>
-                <w:sz w:val="18"/>
+                <w:sz w:val="21"/>
               </w:rPr>
-              <w:t>URAIAN KOMPONEN / AKUN</w:t>
+              <w:t>:</w:t>
             </w:r>
           </w:p>
         </w:tc>
         <w:tc>
           <w:tcPr>
-            <w:tcW w:type="dxa" w:w="1728"/>
-            <w:shd w:val="clear" w:color="auto" w:fill="E0E0E0"/>
+            <w:tcW w:type="dxa" w:w="6378"/>
+            <w:tcMar>
+              <w:top w:w="45" w:type="dxa"/>
+              <w:bottom w:w="45" w:type="dxa"/>
+              <w:left w:w="20" w:type="dxa"/>
+              <w:right w:w="20" w:type="dxa"/>
+            </w:tcMar>
           </w:tcPr>
           <w:p>
+            <w:pPr>
+              <w:spacing w:before="0" w:after="20" w:line="276" w:lineRule="auto"/>
+              <w:jc w:val="both"/>
+            </w:pPr>
             <w:r>
               <w:rPr>
                 <w:rFonts w:ascii="Arial" w:hAnsi="Arial"/>
-                <w:b/>
-                <w:sz w:val="18"/>
+                <w:sz w:val="21"/>
               </w:rPr>
-              <w:t>VOLUME</w:t>
-            </w:r>
-          </w:p>
-        </w:tc>
-        <w:tc>
-          <w:tcPr>
-            <w:tcW w:type="dxa" w:w="1728"/>
-            <w:shd w:val="clear" w:color="auto" w:fill="E0E0E0"/>
-          </w:tcPr>
-          <w:p>
-            <w:r>
-              <w:rPr>
-                <w:rFonts w:ascii="Arial" w:hAnsi="Arial"/>
-                <w:b/>
-                <w:sz w:val="18"/>
-              </w:rPr>
-              <w:t>SATUAN HARGA</w:t>
-            </w:r>
-          </w:p>
-        </w:tc>
-        <w:tc>
-          <w:tcPr>
-            <w:tcW w:type="dxa" w:w="1728"/>
-            <w:shd w:val="clear" w:color="auto" w:fill="E0E0E0"/>
-          </w:tcPr>
-          <w:p>
-            <w:r>
-              <w:rPr>
-                <w:rFonts w:ascii="Arial" w:hAnsi="Arial"/>
-                <w:b/>
-                <w:sz w:val="18"/>
-              </w:rPr>
-              <w:t>JUMLAH (Rp)</w:t>
+              <w:t>(145) Kementerian Pekerjaan Umum</w:t>
             </w:r>
           </w:p>
         </w:tc>
@@ -199,71 +225,74 @@
       <w:tr>
         <w:tc>
           <w:tcPr>
-            <w:tcW w:type="dxa" w:w="1728"/>
+            <w:tcW w:type="dxa" w:w="2721"/>
+            <w:tcMar>
+              <w:top w:w="45" w:type="dxa"/>
+              <w:bottom w:w="45" w:type="dxa"/>
+              <w:left w:w="20" w:type="dxa"/>
+              <w:right w:w="20" w:type="dxa"/>
+            </w:tcMar>
           </w:tcPr>
           <w:p>
+            <w:pPr>
+              <w:spacing w:before="0" w:after="20" w:line="276" w:lineRule="auto"/>
+              <w:jc w:val="left"/>
+            </w:pPr>
             <w:r>
               <w:rPr>
                 <w:rFonts w:ascii="Arial" w:hAnsi="Arial"/>
-                <w:b/>
-                <w:sz w:val="18"/>
+                <w:b w:val="0"/>
+                <w:sz w:val="21"/>
               </w:rPr>
-              <w:t>06.691285</w:t>
+              <w:t>Unit Organisasi</w:t>
             </w:r>
           </w:p>
         </w:tc>
         <w:tc>
           <w:tcPr>
-            <w:tcW w:type="dxa" w:w="1728"/>
+            <w:tcW w:type="dxa" w:w="255"/>
+            <w:tcMar>
+              <w:top w:w="45" w:type="dxa"/>
+              <w:bottom w:w="45" w:type="dxa"/>
+              <w:left w:w="20" w:type="dxa"/>
+              <w:right w:w="20" w:type="dxa"/>
+            </w:tcMar>
           </w:tcPr>
           <w:p>
+            <w:pPr>
+              <w:spacing w:before="0" w:after="20" w:line="276" w:lineRule="auto"/>
+              <w:jc w:val="center"/>
+            </w:pPr>
             <w:r>
               <w:rPr>
                 <w:rFonts w:ascii="Arial" w:hAnsi="Arial"/>
-                <w:sz w:val="18"/>
+                <w:sz w:val="21"/>
               </w:rPr>
-              <w:t>Program Prasarana Strategis</w:t>
+              <w:t>:</w:t>
             </w:r>
           </w:p>
         </w:tc>
         <w:tc>
           <w:tcPr>
-            <w:tcW w:type="dxa" w:w="1728"/>
+            <w:tcW w:type="dxa" w:w="6378"/>
+            <w:tcMar>
+              <w:top w:w="45" w:type="dxa"/>
+              <w:bottom w:w="45" w:type="dxa"/>
+              <w:left w:w="20" w:type="dxa"/>
+              <w:right w:w="20" w:type="dxa"/>
+            </w:tcMar>
           </w:tcPr>
           <w:p>
+            <w:pPr>
+              <w:spacing w:before="0" w:after="20" w:line="276" w:lineRule="auto"/>
+              <w:jc w:val="both"/>
+            </w:pPr>
             <w:r>
               <w:rPr>
                 <w:rFonts w:ascii="Arial" w:hAnsi="Arial"/>
-                <w:sz w:val="18"/>
+                <w:sz w:val="21"/>
               </w:rPr>
-            </w:r>
-          </w:p>
-        </w:tc>
-        <w:tc>
-          <w:tcPr>
-            <w:tcW w:type="dxa" w:w="1728"/>
-          </w:tcPr>
-          <w:p>
-            <w:r>
-              <w:rPr>
-                <w:rFonts w:ascii="Arial" w:hAnsi="Arial"/>
-                <w:sz w:val="18"/>
-              </w:rPr>
-            </w:r>
-          </w:p>
-        </w:tc>
-        <w:tc>
-          <w:tcPr>
-            <w:tcW w:type="dxa" w:w="1728"/>
-          </w:tcPr>
-          <w:p>
-            <w:r>
-              <w:rPr>
-                <w:rFonts w:ascii="Arial" w:hAnsi="Arial"/>
-                <w:b/>
-                <w:sz w:val="18"/>
-              </w:rPr>
-              <w:t>168.538.899.000</w:t>
+              <w:t>(06) Direktorat Jenderal Prasarana Strategis</w:t>
             </w:r>
           </w:p>
         </w:tc>
@@ -271,69 +300,1045 @@
       <w:tr>
         <w:tc>
           <w:tcPr>
-            <w:tcW w:type="dxa" w:w="1728"/>
+            <w:tcW w:type="dxa" w:w="2721"/>
+            <w:tcMar>
+              <w:top w:w="45" w:type="dxa"/>
+              <w:bottom w:w="45" w:type="dxa"/>
+              <w:left w:w="20" w:type="dxa"/>
+              <w:right w:w="20" w:type="dxa"/>
+            </w:tcMar>
           </w:tcPr>
           <w:p>
+            <w:pPr>
+              <w:spacing w:before="0" w:after="20" w:line="276" w:lineRule="auto"/>
+              <w:jc w:val="left"/>
+            </w:pPr>
             <w:r>
               <w:rPr>
                 <w:rFonts w:ascii="Arial" w:hAnsi="Arial"/>
-                <w:b/>
-                <w:sz w:val="18"/>
+                <w:b w:val="0"/>
+                <w:sz w:val="21"/>
               </w:rPr>
-              <w:t>7717</w:t>
+              <w:t>Provinsi / Lokasi</w:t>
             </w:r>
           </w:p>
         </w:tc>
         <w:tc>
           <w:tcPr>
-            <w:tcW w:type="dxa" w:w="1728"/>
+            <w:tcW w:type="dxa" w:w="255"/>
+            <w:tcMar>
+              <w:top w:w="45" w:type="dxa"/>
+              <w:bottom w:w="45" w:type="dxa"/>
+              <w:left w:w="20" w:type="dxa"/>
+              <w:right w:w="20" w:type="dxa"/>
+            </w:tcMar>
           </w:tcPr>
           <w:p>
+            <w:pPr>
+              <w:spacing w:before="0" w:after="20" w:line="276" w:lineRule="auto"/>
+              <w:jc w:val="center"/>
+            </w:pPr>
             <w:r>
               <w:rPr>
                 <w:rFonts w:ascii="Arial" w:hAnsi="Arial"/>
-                <w:sz w:val="18"/>
+                <w:sz w:val="21"/>
               </w:rPr>
-              <w:t>Penyelenggaraan Sarana Prasarana Strategis Lainnya</w:t>
+              <w:t>:</w:t>
             </w:r>
           </w:p>
         </w:tc>
         <w:tc>
           <w:tcPr>
-            <w:tcW w:type="dxa" w:w="1728"/>
+            <w:tcW w:type="dxa" w:w="6378"/>
+            <w:tcMar>
+              <w:top w:w="45" w:type="dxa"/>
+              <w:bottom w:w="45" w:type="dxa"/>
+              <w:left w:w="20" w:type="dxa"/>
+              <w:right w:w="20" w:type="dxa"/>
+            </w:tcMar>
           </w:tcPr>
           <w:p>
+            <w:pPr>
+              <w:spacing w:before="0" w:after="20" w:line="276" w:lineRule="auto"/>
+              <w:jc w:val="both"/>
+            </w:pPr>
             <w:r>
               <w:rPr>
                 <w:rFonts w:ascii="Arial" w:hAnsi="Arial"/>
-                <w:sz w:val="18"/>
+                <w:sz w:val="21"/>
               </w:rPr>
+              <w:t>(09) Provinsi Riau</w:t>
+            </w:r>
+          </w:p>
+        </w:tc>
+      </w:tr>
+      <w:tr>
+        <w:tc>
+          <w:tcPr>
+            <w:tcW w:type="dxa" w:w="2721"/>
+            <w:tcMar>
+              <w:top w:w="45" w:type="dxa"/>
+              <w:bottom w:w="45" w:type="dxa"/>
+              <w:left w:w="20" w:type="dxa"/>
+              <w:right w:w="20" w:type="dxa"/>
+            </w:tcMar>
+          </w:tcPr>
+          <w:p>
+            <w:pPr>
+              <w:spacing w:before="0" w:after="20" w:line="276" w:lineRule="auto"/>
+              <w:jc w:val="left"/>
+            </w:pPr>
+            <w:r>
+              <w:rPr>
+                <w:rFonts w:ascii="Arial" w:hAnsi="Arial"/>
+                <w:b w:val="0"/>
+                <w:sz w:val="21"/>
+              </w:rPr>
+              <w:t>Satuan Kerja</w:t>
             </w:r>
           </w:p>
         </w:tc>
         <w:tc>
           <w:tcPr>
-            <w:tcW w:type="dxa" w:w="1728"/>
+            <w:tcW w:type="dxa" w:w="255"/>
+            <w:tcMar>
+              <w:top w:w="45" w:type="dxa"/>
+              <w:bottom w:w="45" w:type="dxa"/>
+              <w:left w:w="20" w:type="dxa"/>
+              <w:right w:w="20" w:type="dxa"/>
+            </w:tcMar>
           </w:tcPr>
           <w:p>
+            <w:pPr>
+              <w:spacing w:before="0" w:after="20" w:line="276" w:lineRule="auto"/>
+              <w:jc w:val="center"/>
+            </w:pPr>
             <w:r>
               <w:rPr>
                 <w:rFonts w:ascii="Arial" w:hAnsi="Arial"/>
-                <w:sz w:val="18"/>
+                <w:sz w:val="21"/>
               </w:rPr>
+              <w:t>:</w:t>
             </w:r>
           </w:p>
         </w:tc>
         <w:tc>
           <w:tcPr>
-            <w:tcW w:type="dxa" w:w="1728"/>
+            <w:tcW w:type="dxa" w:w="6378"/>
+            <w:tcMar>
+              <w:top w:w="45" w:type="dxa"/>
+              <w:bottom w:w="45" w:type="dxa"/>
+              <w:left w:w="20" w:type="dxa"/>
+              <w:right w:w="20" w:type="dxa"/>
+            </w:tcMar>
           </w:tcPr>
           <w:p>
+            <w:pPr>
+              <w:spacing w:before="0" w:after="20" w:line="276" w:lineRule="auto"/>
+              <w:jc w:val="both"/>
+            </w:pPr>
+            <w:r>
+              <w:rPr>
+                <w:rFonts w:ascii="Arial" w:hAnsi="Arial"/>
+                <w:sz w:val="21"/>
+              </w:rPr>
+              <w:t>(691285) Pelaksanaan Prasarana Strategis Riau</w:t>
+            </w:r>
+          </w:p>
+        </w:tc>
+      </w:tr>
+      <w:tr>
+        <w:tc>
+          <w:tcPr>
+            <w:tcW w:type="dxa" w:w="2721"/>
+            <w:tcMar>
+              <w:top w:w="45" w:type="dxa"/>
+              <w:bottom w:w="45" w:type="dxa"/>
+              <w:left w:w="20" w:type="dxa"/>
+              <w:right w:w="20" w:type="dxa"/>
+            </w:tcMar>
+          </w:tcPr>
+          <w:p>
+            <w:pPr>
+              <w:spacing w:before="0" w:after="20" w:line="276" w:lineRule="auto"/>
+              <w:jc w:val="left"/>
+            </w:pPr>
+            <w:r>
+              <w:rPr>
+                <w:rFonts w:ascii="Arial" w:hAnsi="Arial"/>
+                <w:b w:val="0"/>
+                <w:sz w:val="21"/>
+              </w:rPr>
+              <w:t>Program</w:t>
+            </w:r>
+          </w:p>
+        </w:tc>
+        <w:tc>
+          <w:tcPr>
+            <w:tcW w:type="dxa" w:w="255"/>
+            <w:tcMar>
+              <w:top w:w="45" w:type="dxa"/>
+              <w:bottom w:w="45" w:type="dxa"/>
+              <w:left w:w="20" w:type="dxa"/>
+              <w:right w:w="20" w:type="dxa"/>
+            </w:tcMar>
+          </w:tcPr>
+          <w:p>
+            <w:pPr>
+              <w:spacing w:before="0" w:after="20" w:line="276" w:lineRule="auto"/>
+              <w:jc w:val="center"/>
+            </w:pPr>
+            <w:r>
+              <w:rPr>
+                <w:rFonts w:ascii="Arial" w:hAnsi="Arial"/>
+                <w:sz w:val="21"/>
+              </w:rPr>
+              <w:t>:</w:t>
+            </w:r>
+          </w:p>
+        </w:tc>
+        <w:tc>
+          <w:tcPr>
+            <w:tcW w:type="dxa" w:w="6378"/>
+            <w:tcMar>
+              <w:top w:w="45" w:type="dxa"/>
+              <w:bottom w:w="45" w:type="dxa"/>
+              <w:left w:w="20" w:type="dxa"/>
+              <w:right w:w="20" w:type="dxa"/>
+            </w:tcMar>
+          </w:tcPr>
+          <w:p>
+            <w:pPr>
+              <w:spacing w:before="0" w:after="20" w:line="276" w:lineRule="auto"/>
+              <w:jc w:val="both"/>
+            </w:pPr>
+            <w:r>
+              <w:rPr>
+                <w:rFonts w:ascii="Arial" w:hAnsi="Arial"/>
+                <w:sz w:val="21"/>
+              </w:rPr>
+              <w:t>(06.GM) Program Prasarana Strategis</w:t>
+            </w:r>
+          </w:p>
+        </w:tc>
+      </w:tr>
+      <w:tr>
+        <w:tc>
+          <w:tcPr>
+            <w:tcW w:type="dxa" w:w="2721"/>
+            <w:tcMar>
+              <w:top w:w="45" w:type="dxa"/>
+              <w:bottom w:w="45" w:type="dxa"/>
+              <w:left w:w="20" w:type="dxa"/>
+              <w:right w:w="20" w:type="dxa"/>
+            </w:tcMar>
+          </w:tcPr>
+          <w:p>
+            <w:pPr>
+              <w:spacing w:before="0" w:after="20" w:line="276" w:lineRule="auto"/>
+              <w:jc w:val="left"/>
+            </w:pPr>
+            <w:r>
+              <w:rPr>
+                <w:rFonts w:ascii="Arial" w:hAnsi="Arial"/>
+                <w:b w:val="0"/>
+                <w:sz w:val="21"/>
+              </w:rPr>
+              <w:t>Kegiatan</w:t>
+            </w:r>
+          </w:p>
+        </w:tc>
+        <w:tc>
+          <w:tcPr>
+            <w:tcW w:type="dxa" w:w="255"/>
+            <w:tcMar>
+              <w:top w:w="45" w:type="dxa"/>
+              <w:bottom w:w="45" w:type="dxa"/>
+              <w:left w:w="20" w:type="dxa"/>
+              <w:right w:w="20" w:type="dxa"/>
+            </w:tcMar>
+          </w:tcPr>
+          <w:p>
+            <w:pPr>
+              <w:spacing w:before="0" w:after="20" w:line="276" w:lineRule="auto"/>
+              <w:jc w:val="center"/>
+            </w:pPr>
+            <w:r>
+              <w:rPr>
+                <w:rFonts w:ascii="Arial" w:hAnsi="Arial"/>
+                <w:sz w:val="21"/>
+              </w:rPr>
+              <w:t>:</w:t>
+            </w:r>
+          </w:p>
+        </w:tc>
+        <w:tc>
+          <w:tcPr>
+            <w:tcW w:type="dxa" w:w="6378"/>
+            <w:tcMar>
+              <w:top w:w="45" w:type="dxa"/>
+              <w:bottom w:w="45" w:type="dxa"/>
+              <w:left w:w="20" w:type="dxa"/>
+              <w:right w:w="20" w:type="dxa"/>
+            </w:tcMar>
+          </w:tcPr>
+          <w:p>
+            <w:pPr>
+              <w:spacing w:before="0" w:after="20" w:line="276" w:lineRule="auto"/>
+              <w:jc w:val="both"/>
+            </w:pPr>
+            <w:r>
+              <w:rPr>
+                <w:rFonts w:ascii="Arial" w:hAnsi="Arial"/>
+                <w:sz w:val="21"/>
+              </w:rPr>
+              <w:t>(7717) Pembangunan dan Rehabilitasi Prasarana Strategis</w:t>
+            </w:r>
+          </w:p>
+        </w:tc>
+      </w:tr>
+      <w:tr>
+        <w:tc>
+          <w:tcPr>
+            <w:tcW w:type="dxa" w:w="2721"/>
+            <w:tcMar>
+              <w:top w:w="45" w:type="dxa"/>
+              <w:bottom w:w="45" w:type="dxa"/>
+              <w:left w:w="20" w:type="dxa"/>
+              <w:right w:w="20" w:type="dxa"/>
+            </w:tcMar>
+          </w:tcPr>
+          <w:p>
+            <w:pPr>
+              <w:spacing w:before="0" w:after="20" w:line="276" w:lineRule="auto"/>
+              <w:jc w:val="left"/>
+            </w:pPr>
+            <w:r>
+              <w:rPr>
+                <w:rFonts w:ascii="Arial" w:hAnsi="Arial"/>
+                <w:b w:val="0"/>
+                <w:sz w:val="21"/>
+              </w:rPr>
+              <w:t>Klasifikasi Rincian Output</w:t>
+            </w:r>
+          </w:p>
+        </w:tc>
+        <w:tc>
+          <w:tcPr>
+            <w:tcW w:type="dxa" w:w="255"/>
+            <w:tcMar>
+              <w:top w:w="45" w:type="dxa"/>
+              <w:bottom w:w="45" w:type="dxa"/>
+              <w:left w:w="20" w:type="dxa"/>
+              <w:right w:w="20" w:type="dxa"/>
+            </w:tcMar>
+          </w:tcPr>
+          <w:p>
+            <w:pPr>
+              <w:spacing w:before="0" w:after="20" w:line="276" w:lineRule="auto"/>
+              <w:jc w:val="center"/>
+            </w:pPr>
+            <w:r>
+              <w:rPr>
+                <w:rFonts w:ascii="Arial" w:hAnsi="Arial"/>
+                <w:sz w:val="21"/>
+              </w:rPr>
+              <w:t>:</w:t>
+            </w:r>
+          </w:p>
+        </w:tc>
+        <w:tc>
+          <w:tcPr>
+            <w:tcW w:type="dxa" w:w="6378"/>
+            <w:tcMar>
+              <w:top w:w="45" w:type="dxa"/>
+              <w:bottom w:w="45" w:type="dxa"/>
+              <w:left w:w="20" w:type="dxa"/>
+              <w:right w:w="20" w:type="dxa"/>
+            </w:tcMar>
+          </w:tcPr>
+          <w:p>
+            <w:pPr>
+              <w:spacing w:before="0" w:after="20" w:line="276" w:lineRule="auto"/>
+              <w:jc w:val="both"/>
+            </w:pPr>
+            <w:r>
+              <w:rPr>
+                <w:rFonts w:ascii="Arial" w:hAnsi="Arial"/>
+                <w:sz w:val="21"/>
+              </w:rPr>
+              <w:t>(7717.CBI) Sarana dan Prasarana Pendidikan / Sosial Strategis</w:t>
+            </w:r>
+          </w:p>
+        </w:tc>
+      </w:tr>
+      <w:tr>
+        <w:tc>
+          <w:tcPr>
+            <w:tcW w:type="dxa" w:w="2721"/>
+            <w:tcMar>
+              <w:top w:w="45" w:type="dxa"/>
+              <w:bottom w:w="45" w:type="dxa"/>
+              <w:left w:w="20" w:type="dxa"/>
+              <w:right w:w="20" w:type="dxa"/>
+            </w:tcMar>
+          </w:tcPr>
+          <w:p>
+            <w:pPr>
+              <w:spacing w:before="0" w:after="20" w:line="276" w:lineRule="auto"/>
+              <w:jc w:val="left"/>
+            </w:pPr>
+            <w:r>
+              <w:rPr>
+                <w:rFonts w:ascii="Arial" w:hAnsi="Arial"/>
+                <w:b w:val="0"/>
+                <w:sz w:val="21"/>
+              </w:rPr>
+              <w:t>Rincian Output (RO)</w:t>
+            </w:r>
+          </w:p>
+        </w:tc>
+        <w:tc>
+          <w:tcPr>
+            <w:tcW w:type="dxa" w:w="255"/>
+            <w:tcMar>
+              <w:top w:w="45" w:type="dxa"/>
+              <w:bottom w:w="45" w:type="dxa"/>
+              <w:left w:w="20" w:type="dxa"/>
+              <w:right w:w="20" w:type="dxa"/>
+            </w:tcMar>
+          </w:tcPr>
+          <w:p>
+            <w:pPr>
+              <w:spacing w:before="0" w:after="20" w:line="276" w:lineRule="auto"/>
+              <w:jc w:val="center"/>
+            </w:pPr>
+            <w:r>
+              <w:rPr>
+                <w:rFonts w:ascii="Arial" w:hAnsi="Arial"/>
+                <w:sz w:val="21"/>
+              </w:rPr>
+              <w:t>:</w:t>
+            </w:r>
+          </w:p>
+        </w:tc>
+        <w:tc>
+          <w:tcPr>
+            <w:tcW w:type="dxa" w:w="6378"/>
+            <w:tcMar>
+              <w:top w:w="45" w:type="dxa"/>
+              <w:bottom w:w="45" w:type="dxa"/>
+              <w:left w:w="20" w:type="dxa"/>
+              <w:right w:w="20" w:type="dxa"/>
+            </w:tcMar>
+          </w:tcPr>
+          <w:p>
+            <w:pPr>
+              <w:spacing w:before="0" w:after="20" w:line="276" w:lineRule="auto"/>
+              <w:jc w:val="both"/>
+            </w:pPr>
+            <w:r>
+              <w:rPr>
+                <w:rFonts w:ascii="Arial" w:hAnsi="Arial"/>
+                <w:sz w:val="21"/>
+              </w:rPr>
+              <w:t>(7717.CBI.001) Pembangunan Gedung SPPG Provinsi Riau</w:t>
+            </w:r>
+          </w:p>
+        </w:tc>
+      </w:tr>
+      <w:tr>
+        <w:tc>
+          <w:tcPr>
+            <w:tcW w:type="dxa" w:w="2721"/>
+            <w:tcMar>
+              <w:top w:w="45" w:type="dxa"/>
+              <w:bottom w:w="45" w:type="dxa"/>
+              <w:left w:w="20" w:type="dxa"/>
+              <w:right w:w="20" w:type="dxa"/>
+            </w:tcMar>
+          </w:tcPr>
+          <w:p>
+            <w:pPr>
+              <w:spacing w:before="0" w:after="20" w:line="276" w:lineRule="auto"/>
+              <w:jc w:val="left"/>
+            </w:pPr>
+            <w:r>
+              <w:rPr>
+                <w:rFonts w:ascii="Arial" w:hAnsi="Arial"/>
+                <w:b w:val="0"/>
+                <w:sz w:val="21"/>
+              </w:rPr>
+              <w:t>Komponen</w:t>
+            </w:r>
+          </w:p>
+        </w:tc>
+        <w:tc>
+          <w:tcPr>
+            <w:tcW w:type="dxa" w:w="255"/>
+            <w:tcMar>
+              <w:top w:w="45" w:type="dxa"/>
+              <w:bottom w:w="45" w:type="dxa"/>
+              <w:left w:w="20" w:type="dxa"/>
+              <w:right w:w="20" w:type="dxa"/>
+            </w:tcMar>
+          </w:tcPr>
+          <w:p>
+            <w:pPr>
+              <w:spacing w:before="0" w:after="20" w:line="276" w:lineRule="auto"/>
+              <w:jc w:val="center"/>
+            </w:pPr>
+            <w:r>
+              <w:rPr>
+                <w:rFonts w:ascii="Arial" w:hAnsi="Arial"/>
+                <w:sz w:val="21"/>
+              </w:rPr>
+              <w:t>:</w:t>
+            </w:r>
+          </w:p>
+        </w:tc>
+        <w:tc>
+          <w:tcPr>
+            <w:tcW w:type="dxa" w:w="6378"/>
+            <w:tcMar>
+              <w:top w:w="45" w:type="dxa"/>
+              <w:bottom w:w="45" w:type="dxa"/>
+              <w:left w:w="20" w:type="dxa"/>
+              <w:right w:w="20" w:type="dxa"/>
+            </w:tcMar>
+          </w:tcPr>
+          <w:p>
+            <w:pPr>
+              <w:spacing w:before="0" w:after="20" w:line="276" w:lineRule="auto"/>
+              <w:jc w:val="both"/>
+            </w:pPr>
+            <w:r>
+              <w:rPr>
+                <w:rFonts w:ascii="Arial" w:hAnsi="Arial"/>
+                <w:sz w:val="21"/>
+              </w:rPr>
+              <w:t>(900) Dukungan Manajemen &amp; Administrasi Kegiatan Pembangunan</w:t>
+            </w:r>
+          </w:p>
+        </w:tc>
+      </w:tr>
+      <w:tr>
+        <w:tc>
+          <w:tcPr>
+            <w:tcW w:type="dxa" w:w="2721"/>
+            <w:tcMar>
+              <w:top w:w="45" w:type="dxa"/>
+              <w:bottom w:w="45" w:type="dxa"/>
+              <w:left w:w="20" w:type="dxa"/>
+              <w:right w:w="20" w:type="dxa"/>
+            </w:tcMar>
+          </w:tcPr>
+          <w:p>
+            <w:pPr>
+              <w:spacing w:before="0" w:after="20" w:line="276" w:lineRule="auto"/>
+              <w:jc w:val="left"/>
+            </w:pPr>
+            <w:r>
+              <w:rPr>
+                <w:rFonts w:ascii="Arial" w:hAnsi="Arial"/>
+                <w:b w:val="0"/>
+                <w:sz w:val="21"/>
+              </w:rPr>
+              <w:t>Subkomponen</w:t>
+            </w:r>
+          </w:p>
+        </w:tc>
+        <w:tc>
+          <w:tcPr>
+            <w:tcW w:type="dxa" w:w="255"/>
+            <w:tcMar>
+              <w:top w:w="45" w:type="dxa"/>
+              <w:bottom w:w="45" w:type="dxa"/>
+              <w:left w:w="20" w:type="dxa"/>
+              <w:right w:w="20" w:type="dxa"/>
+            </w:tcMar>
+          </w:tcPr>
+          <w:p>
+            <w:pPr>
+              <w:spacing w:before="0" w:after="20" w:line="276" w:lineRule="auto"/>
+              <w:jc w:val="center"/>
+            </w:pPr>
+            <w:r>
+              <w:rPr>
+                <w:rFonts w:ascii="Arial" w:hAnsi="Arial"/>
+                <w:sz w:val="21"/>
+              </w:rPr>
+              <w:t>:</w:t>
+            </w:r>
+          </w:p>
+        </w:tc>
+        <w:tc>
+          <w:tcPr>
+            <w:tcW w:type="dxa" w:w="6378"/>
+            <w:tcMar>
+              <w:top w:w="45" w:type="dxa"/>
+              <w:bottom w:w="45" w:type="dxa"/>
+              <w:left w:w="20" w:type="dxa"/>
+              <w:right w:w="20" w:type="dxa"/>
+            </w:tcMar>
+          </w:tcPr>
+          <w:p>
+            <w:pPr>
+              <w:spacing w:before="0" w:after="20" w:line="276" w:lineRule="auto"/>
+              <w:jc w:val="both"/>
+            </w:pPr>
+            <w:r>
+              <w:rPr>
+                <w:rFonts w:ascii="Arial" w:hAnsi="Arial"/>
+                <w:sz w:val="21"/>
+              </w:rPr>
+              <w:t>(A) Administrasi Kegiatan Pembangunan Gedung SPPG Provinsi Riau</w:t>
+            </w:r>
+          </w:p>
+        </w:tc>
+      </w:tr>
+      <w:tr>
+        <w:tc>
+          <w:tcPr>
+            <w:tcW w:type="dxa" w:w="2721"/>
+            <w:tcMar>
+              <w:top w:w="45" w:type="dxa"/>
+              <w:bottom w:w="45" w:type="dxa"/>
+              <w:left w:w="20" w:type="dxa"/>
+              <w:right w:w="20" w:type="dxa"/>
+            </w:tcMar>
+          </w:tcPr>
+          <w:p>
+            <w:pPr>
+              <w:spacing w:before="0" w:after="20" w:line="276" w:lineRule="auto"/>
+              <w:jc w:val="left"/>
+            </w:pPr>
+            <w:r>
+              <w:rPr>
+                <w:rFonts w:ascii="Arial" w:hAnsi="Arial"/>
+                <w:b w:val="0"/>
+                <w:sz w:val="21"/>
+              </w:rPr>
+              <w:t>Cara Penarikan / Metode</w:t>
+            </w:r>
+          </w:p>
+        </w:tc>
+        <w:tc>
+          <w:tcPr>
+            <w:tcW w:type="dxa" w:w="255"/>
+            <w:tcMar>
+              <w:top w:w="45" w:type="dxa"/>
+              <w:bottom w:w="45" w:type="dxa"/>
+              <w:left w:w="20" w:type="dxa"/>
+              <w:right w:w="20" w:type="dxa"/>
+            </w:tcMar>
+          </w:tcPr>
+          <w:p>
+            <w:pPr>
+              <w:spacing w:before="0" w:after="20" w:line="276" w:lineRule="auto"/>
+              <w:jc w:val="center"/>
+            </w:pPr>
+            <w:r>
+              <w:rPr>
+                <w:rFonts w:ascii="Arial" w:hAnsi="Arial"/>
+                <w:sz w:val="21"/>
+              </w:rPr>
+              <w:t>:</w:t>
+            </w:r>
+          </w:p>
+        </w:tc>
+        <w:tc>
+          <w:tcPr>
+            <w:tcW w:type="dxa" w:w="6378"/>
+            <w:tcMar>
+              <w:top w:w="45" w:type="dxa"/>
+              <w:bottom w:w="45" w:type="dxa"/>
+              <w:left w:w="20" w:type="dxa"/>
+              <w:right w:w="20" w:type="dxa"/>
+            </w:tcMar>
+          </w:tcPr>
+          <w:p>
+            <w:pPr>
+              <w:spacing w:before="0" w:after="20" w:line="276" w:lineRule="auto"/>
+              <w:jc w:val="both"/>
+            </w:pPr>
+            <w:r>
+              <w:rPr>
+                <w:rFonts w:ascii="Arial" w:hAnsi="Arial"/>
+                <w:sz w:val="21"/>
+              </w:rPr>
+              <w:t>Rupiah Murni (RM) / Swakelola Tipe I</w:t>
+            </w:r>
+          </w:p>
+        </w:tc>
+      </w:tr>
+    </w:tbl>
+    <w:p>
+      <w:pPr>
+        <w:spacing w:before="0" w:after="80"/>
+      </w:pPr>
+    </w:p>
+    <w:p>
+      <w:pPr>
+        <w:keepNext/>
+        <w:spacing w:before="160" w:after="80"/>
+        <w:jc w:val="left"/>
+      </w:pPr>
+      <w:r>
+        <w:rPr>
+          <w:rFonts w:ascii="Arial" w:hAnsi="Arial"/>
+          <w:b/>
+          <w:sz w:val="21"/>
+        </w:rPr>
+        <w:t>II. RINCIAN ALOKASI ANGGARAN POK KEGIATAN SPPG</w:t>
+      </w:r>
+    </w:p>
+    <w:tbl>
+      <w:tblPr>
+        <w:tblW w:type="auto" w:w="0"/>
+        <w:jc w:val="center"/>
+        <w:tblLayout w:type="fixed"/>
+        <w:tblLook w:firstColumn="1" w:firstRow="1" w:lastColumn="0" w:lastRow="0" w:noHBand="0" w:noVBand="1" w:val="04A0"/>
+        <w:tblBorders>
+          <w:top w:val="single" w:sz="4" w:space="0" w:color="444444"/>
+          <w:left w:val="single" w:sz="4" w:space="0" w:color="444444"/>
+          <w:bottom w:val="single" w:sz="4" w:space="0" w:color="444444"/>
+          <w:right w:val="single" w:sz="4" w:space="0" w:color="444444"/>
+          <w:insideH w:val="single" w:sz="4" w:space="0" w:color="444444"/>
+          <w:insideV w:val="single" w:sz="4" w:space="0" w:color="444444"/>
+        </w:tblBorders>
+      </w:tblPr>
+      <w:tblGrid>
+        <w:gridCol w:w="1559"/>
+        <w:gridCol w:w="1559"/>
+        <w:gridCol w:w="1559"/>
+        <w:gridCol w:w="1559"/>
+        <w:gridCol w:w="1559"/>
+        <w:gridCol w:w="1559"/>
+      </w:tblGrid>
+      <w:tr>
+        <w:trPr>
+          <w:tblHeader/>
+          <w:cantSplit/>
+        </w:trPr>
+        <w:tc>
+          <w:tcPr>
+            <w:tcW w:type="dxa" w:w="1814"/>
+            <w:vAlign w:val="center"/>
+            <w:shd w:fill="D9E2F3"/>
+            <w:tcMar>
+              <w:top w:w="90" w:type="dxa"/>
+              <w:bottom w:w="90" w:type="dxa"/>
+              <w:left w:w="110" w:type="dxa"/>
+              <w:right w:w="110" w:type="dxa"/>
+            </w:tcMar>
+          </w:tcPr>
+          <w:p>
+            <w:pPr>
+              <w:spacing w:before="0" w:after="0" w:line="276" w:lineRule="auto"/>
+              <w:jc w:val="center"/>
+            </w:pPr>
             <w:r>
               <w:rPr>
                 <w:rFonts w:ascii="Arial" w:hAnsi="Arial"/>
                 <w:b/>
-                <w:sz w:val="18"/>
+                <w:sz w:val="19"/>
+              </w:rPr>
+              <w:t>Kode Akun / MAK</w:t>
+            </w:r>
+          </w:p>
+        </w:tc>
+        <w:tc>
+          <w:tcPr>
+            <w:tcW w:type="dxa" w:w="3118"/>
+            <w:vAlign w:val="center"/>
+            <w:shd w:fill="D9E2F3"/>
+            <w:tcMar>
+              <w:top w:w="90" w:type="dxa"/>
+              <w:bottom w:w="90" w:type="dxa"/>
+              <w:left w:w="110" w:type="dxa"/>
+              <w:right w:w="110" w:type="dxa"/>
+            </w:tcMar>
+          </w:tcPr>
+          <w:p>
+            <w:pPr>
+              <w:spacing w:before="0" w:after="0" w:line="276" w:lineRule="auto"/>
+              <w:jc w:val="center"/>
+            </w:pPr>
+            <w:r>
+              <w:rPr>
+                <w:rFonts w:ascii="Arial" w:hAnsi="Arial"/>
+                <w:b/>
+                <w:sz w:val="19"/>
+              </w:rPr>
+              <w:t>Uraian Komponen / Rincian Belanja POK</w:t>
+            </w:r>
+          </w:p>
+        </w:tc>
+        <w:tc>
+          <w:tcPr>
+            <w:tcW w:type="dxa" w:w="737"/>
+            <w:vAlign w:val="center"/>
+            <w:shd w:fill="D9E2F3"/>
+            <w:tcMar>
+              <w:top w:w="90" w:type="dxa"/>
+              <w:bottom w:w="90" w:type="dxa"/>
+              <w:left w:w="110" w:type="dxa"/>
+              <w:right w:w="110" w:type="dxa"/>
+            </w:tcMar>
+          </w:tcPr>
+          <w:p>
+            <w:pPr>
+              <w:spacing w:before="0" w:after="0" w:line="276" w:lineRule="auto"/>
+              <w:jc w:val="center"/>
+            </w:pPr>
+            <w:r>
+              <w:rPr>
+                <w:rFonts w:ascii="Arial" w:hAnsi="Arial"/>
+                <w:b/>
+                <w:sz w:val="19"/>
+              </w:rPr>
+              <w:t>Volume</w:t>
+            </w:r>
+          </w:p>
+        </w:tc>
+        <w:tc>
+          <w:tcPr>
+            <w:tcW w:type="dxa" w:w="850"/>
+            <w:vAlign w:val="center"/>
+            <w:shd w:fill="D9E2F3"/>
+            <w:tcMar>
+              <w:top w:w="90" w:type="dxa"/>
+              <w:bottom w:w="90" w:type="dxa"/>
+              <w:left w:w="110" w:type="dxa"/>
+              <w:right w:w="110" w:type="dxa"/>
+            </w:tcMar>
+          </w:tcPr>
+          <w:p>
+            <w:pPr>
+              <w:spacing w:before="0" w:after="0" w:line="276" w:lineRule="auto"/>
+              <w:jc w:val="center"/>
+            </w:pPr>
+            <w:r>
+              <w:rPr>
+                <w:rFonts w:ascii="Arial" w:hAnsi="Arial"/>
+                <w:b/>
+                <w:sz w:val="19"/>
+              </w:rPr>
+              <w:t>Satuan</w:t>
+            </w:r>
+          </w:p>
+        </w:tc>
+        <w:tc>
+          <w:tcPr>
+            <w:tcW w:type="dxa" w:w="1417"/>
+            <w:vAlign w:val="center"/>
+            <w:shd w:fill="D9E2F3"/>
+            <w:tcMar>
+              <w:top w:w="90" w:type="dxa"/>
+              <w:bottom w:w="90" w:type="dxa"/>
+              <w:left w:w="110" w:type="dxa"/>
+              <w:right w:w="110" w:type="dxa"/>
+            </w:tcMar>
+          </w:tcPr>
+          <w:p>
+            <w:pPr>
+              <w:spacing w:before="0" w:after="0" w:line="276" w:lineRule="auto"/>
+              <w:jc w:val="center"/>
+            </w:pPr>
+            <w:r>
+              <w:rPr>
+                <w:rFonts w:ascii="Arial" w:hAnsi="Arial"/>
+                <w:b/>
+                <w:sz w:val="19"/>
+              </w:rPr>
+              <w:t>Harga Satuan (Rp)</w:t>
+            </w:r>
+          </w:p>
+        </w:tc>
+        <w:tc>
+          <w:tcPr>
+            <w:tcW w:type="dxa" w:w="1417"/>
+            <w:vAlign w:val="center"/>
+            <w:shd w:fill="D9E2F3"/>
+            <w:tcMar>
+              <w:top w:w="90" w:type="dxa"/>
+              <w:bottom w:w="90" w:type="dxa"/>
+              <w:left w:w="110" w:type="dxa"/>
+              <w:right w:w="110" w:type="dxa"/>
+            </w:tcMar>
+          </w:tcPr>
+          <w:p>
+            <w:pPr>
+              <w:spacing w:before="0" w:after="0" w:line="276" w:lineRule="auto"/>
+              <w:jc w:val="center"/>
+            </w:pPr>
+            <w:r>
+              <w:rPr>
+                <w:rFonts w:ascii="Arial" w:hAnsi="Arial"/>
+                <w:b/>
+                <w:sz w:val="19"/>
+              </w:rPr>
+              <w:t>Jumlah Pagu (Rp)</w:t>
+            </w:r>
+          </w:p>
+        </w:tc>
+      </w:tr>
+      <w:tr>
+        <w:trPr>
+          <w:cantSplit/>
+        </w:trPr>
+        <w:tc>
+          <w:tcPr>
+            <w:tcW w:type="dxa" w:w="1814"/>
+            <w:vAlign w:val="center"/>
+            <w:tcMar>
+              <w:top w:w="75" w:type="dxa"/>
+              <w:bottom w:w="75" w:type="dxa"/>
+              <w:left w:w="110" w:type="dxa"/>
+              <w:right w:w="110" w:type="dxa"/>
+            </w:tcMar>
+          </w:tcPr>
+          <w:p>
+            <w:pPr>
+              <w:spacing w:before="0" w:after="0" w:line="276" w:lineRule="auto"/>
+              <w:jc w:val="left"/>
+            </w:pPr>
+            <w:r>
+              <w:rPr>
+                <w:rFonts w:ascii="Arial" w:hAnsi="Arial"/>
+                <w:b w:val="0"/>
+                <w:sz w:val="19"/>
+              </w:rPr>
+              <w:t>06.691285.GM.7717.CBI.001.900.A</w:t>
+            </w:r>
+          </w:p>
+        </w:tc>
+        <w:tc>
+          <w:tcPr>
+            <w:tcW w:type="dxa" w:w="3118"/>
+            <w:vAlign w:val="center"/>
+            <w:tcMar>
+              <w:top w:w="75" w:type="dxa"/>
+              <w:bottom w:w="75" w:type="dxa"/>
+              <w:left w:w="110" w:type="dxa"/>
+              <w:right w:w="110" w:type="dxa"/>
+            </w:tcMar>
+          </w:tcPr>
+          <w:p>
+            <w:pPr>
+              <w:spacing w:before="0" w:after="0" w:line="276" w:lineRule="auto"/>
+              <w:jc w:val="both"/>
+            </w:pPr>
+            <w:r>
+              <w:rPr>
+                <w:rFonts w:ascii="Arial" w:hAnsi="Arial"/>
+                <w:b w:val="0"/>
+                <w:sz w:val="19"/>
+              </w:rPr>
+              <w:t>Administrasi Kegiatan Pembangunan Gedung SPPG Provinsi Riau</w:t>
+            </w:r>
+          </w:p>
+        </w:tc>
+        <w:tc>
+          <w:tcPr>
+            <w:tcW w:type="dxa" w:w="737"/>
+            <w:vAlign w:val="center"/>
+            <w:tcMar>
+              <w:top w:w="75" w:type="dxa"/>
+              <w:bottom w:w="75" w:type="dxa"/>
+              <w:left w:w="110" w:type="dxa"/>
+              <w:right w:w="110" w:type="dxa"/>
+            </w:tcMar>
+          </w:tcPr>
+          <w:p>
+            <w:pPr>
+              <w:spacing w:before="0" w:after="0" w:line="276" w:lineRule="auto"/>
+              <w:jc w:val="center"/>
+            </w:pPr>
+            <w:r>
+              <w:rPr>
+                <w:rFonts w:ascii="Arial" w:hAnsi="Arial"/>
+                <w:b w:val="0"/>
+                <w:sz w:val="19"/>
+              </w:rPr>
+              <w:t>1,00</w:t>
+            </w:r>
+          </w:p>
+        </w:tc>
+        <w:tc>
+          <w:tcPr>
+            <w:tcW w:type="dxa" w:w="850"/>
+            <w:vAlign w:val="center"/>
+            <w:tcMar>
+              <w:top w:w="75" w:type="dxa"/>
+              <w:bottom w:w="75" w:type="dxa"/>
+              <w:left w:w="110" w:type="dxa"/>
+              <w:right w:w="110" w:type="dxa"/>
+            </w:tcMar>
+          </w:tcPr>
+          <w:p>
+            <w:pPr>
+              <w:spacing w:before="0" w:after="0" w:line="276" w:lineRule="auto"/>
+              <w:jc w:val="center"/>
+            </w:pPr>
+            <w:r>
+              <w:rPr>
+                <w:rFonts w:ascii="Arial" w:hAnsi="Arial"/>
+                <w:b w:val="0"/>
+                <w:sz w:val="19"/>
+              </w:rPr>
+              <w:t>Layanan</w:t>
+            </w:r>
+          </w:p>
+        </w:tc>
+        <w:tc>
+          <w:tcPr>
+            <w:tcW w:type="dxa" w:w="1417"/>
+            <w:vAlign w:val="center"/>
+            <w:tcMar>
+              <w:top w:w="75" w:type="dxa"/>
+              <w:bottom w:w="75" w:type="dxa"/>
+              <w:left w:w="110" w:type="dxa"/>
+              <w:right w:w="110" w:type="dxa"/>
+            </w:tcMar>
+          </w:tcPr>
+          <w:p>
+            <w:pPr>
+              <w:spacing w:before="0" w:after="0" w:line="276" w:lineRule="auto"/>
+              <w:jc w:val="right"/>
+            </w:pPr>
+            <w:r>
+              <w:rPr>
+                <w:rFonts w:ascii="Arial" w:hAnsi="Arial"/>
+                <w:b w:val="0"/>
+                <w:sz w:val="19"/>
+              </w:rPr>
+              <w:t>413.000.000</w:t>
+            </w:r>
+          </w:p>
+        </w:tc>
+        <w:tc>
+          <w:tcPr>
+            <w:tcW w:type="dxa" w:w="1417"/>
+            <w:vAlign w:val="center"/>
+            <w:tcMar>
+              <w:top w:w="75" w:type="dxa"/>
+              <w:bottom w:w="75" w:type="dxa"/>
+              <w:left w:w="110" w:type="dxa"/>
+              <w:right w:w="110" w:type="dxa"/>
+            </w:tcMar>
+          </w:tcPr>
+          <w:p>
+            <w:pPr>
+              <w:spacing w:before="0" w:after="0" w:line="276" w:lineRule="auto"/>
+              <w:jc w:val="right"/>
+            </w:pPr>
+            <w:r>
+              <w:rPr>
+                <w:rFonts w:ascii="Arial" w:hAnsi="Arial"/>
+                <w:b w:val="0"/>
+                <w:sz w:val="19"/>
               </w:rPr>
               <w:t>413.000.000</w:t>
             </w:r>
@@ -341,161 +1346,30 @@
         </w:tc>
       </w:tr>
       <w:tr>
+        <w:trPr>
+          <w:cantSplit/>
+        </w:trPr>
         <w:tc>
           <w:tcPr>
-            <w:tcW w:type="dxa" w:w="1728"/>
+            <w:tcW w:type="dxa" w:w="1814"/>
+            <w:vAlign w:val="center"/>
+            <w:tcMar>
+              <w:top w:w="75" w:type="dxa"/>
+              <w:bottom w:w="75" w:type="dxa"/>
+              <w:left w:w="110" w:type="dxa"/>
+              <w:right w:w="110" w:type="dxa"/>
+            </w:tcMar>
           </w:tcPr>
           <w:p>
+            <w:pPr>
+              <w:spacing w:before="0" w:after="0" w:line="276" w:lineRule="auto"/>
+              <w:jc w:val="center"/>
+            </w:pPr>
             <w:r>
               <w:rPr>
                 <w:rFonts w:ascii="Arial" w:hAnsi="Arial"/>
-                <w:b/>
-                <w:sz w:val="18"/>
-              </w:rPr>
-              <w:t>7717.CBI.001</w:t>
-            </w:r>
-          </w:p>
-        </w:tc>
-        <w:tc>
-          <w:tcPr>
-            <w:tcW w:type="dxa" w:w="1728"/>
-          </w:tcPr>
-          <w:p>
-            <w:r>
-              <w:rPr>
-                <w:rFonts w:ascii="Arial" w:hAnsi="Arial"/>
-                <w:sz w:val="18"/>
-              </w:rPr>
-              <w:t>Pembangunan Satuan Pelayanan Pemenuhan Gizi (SPPG)</w:t>
-            </w:r>
-          </w:p>
-        </w:tc>
-        <w:tc>
-          <w:tcPr>
-            <w:tcW w:type="dxa" w:w="1728"/>
-          </w:tcPr>
-          <w:p>
-            <w:r>
-              <w:rPr>
-                <w:rFonts w:ascii="Arial" w:hAnsi="Arial"/>
-                <w:sz w:val="18"/>
-              </w:rPr>
-              <w:t>1 RO</w:t>
-            </w:r>
-          </w:p>
-        </w:tc>
-        <w:tc>
-          <w:tcPr>
-            <w:tcW w:type="dxa" w:w="1728"/>
-          </w:tcPr>
-          <w:p>
-            <w:r>
-              <w:rPr>
-                <w:rFonts w:ascii="Arial" w:hAnsi="Arial"/>
-                <w:sz w:val="18"/>
-              </w:rPr>
-            </w:r>
-          </w:p>
-        </w:tc>
-        <w:tc>
-          <w:tcPr>
-            <w:tcW w:type="dxa" w:w="1728"/>
-          </w:tcPr>
-          <w:p>
-            <w:r>
-              <w:rPr>
-                <w:rFonts w:ascii="Arial" w:hAnsi="Arial"/>
-                <w:b/>
-                <w:sz w:val="18"/>
-              </w:rPr>
-              <w:t>413.000.000</w:t>
-            </w:r>
-          </w:p>
-        </w:tc>
-      </w:tr>
-      <w:tr>
-        <w:tc>
-          <w:tcPr>
-            <w:tcW w:type="dxa" w:w="1728"/>
-          </w:tcPr>
-          <w:p>
-            <w:r>
-              <w:rPr>
-                <w:rFonts w:ascii="Arial" w:hAnsi="Arial"/>
-                <w:b/>
-                <w:sz w:val="18"/>
-              </w:rPr>
-              <w:t>001.900.A</w:t>
-            </w:r>
-          </w:p>
-        </w:tc>
-        <w:tc>
-          <w:tcPr>
-            <w:tcW w:type="dxa" w:w="1728"/>
-          </w:tcPr>
-          <w:p>
-            <w:r>
-              <w:rPr>
-                <w:rFonts w:ascii="Arial" w:hAnsi="Arial"/>
-                <w:sz w:val="18"/>
-              </w:rPr>
-              <w:t>Administrasi Kegiatan Pembangunan Gedung SPPG Provinsi Riau</w:t>
-            </w:r>
-          </w:p>
-        </w:tc>
-        <w:tc>
-          <w:tcPr>
-            <w:tcW w:type="dxa" w:w="1728"/>
-          </w:tcPr>
-          <w:p>
-            <w:r>
-              <w:rPr>
-                <w:rFonts w:ascii="Arial" w:hAnsi="Arial"/>
-                <w:sz w:val="18"/>
-              </w:rPr>
-            </w:r>
-          </w:p>
-        </w:tc>
-        <w:tc>
-          <w:tcPr>
-            <w:tcW w:type="dxa" w:w="1728"/>
-          </w:tcPr>
-          <w:p>
-            <w:r>
-              <w:rPr>
-                <w:rFonts w:ascii="Arial" w:hAnsi="Arial"/>
-                <w:sz w:val="18"/>
-              </w:rPr>
-            </w:r>
-          </w:p>
-        </w:tc>
-        <w:tc>
-          <w:tcPr>
-            <w:tcW w:type="dxa" w:w="1728"/>
-          </w:tcPr>
-          <w:p>
-            <w:r>
-              <w:rPr>
-                <w:rFonts w:ascii="Arial" w:hAnsi="Arial"/>
-                <w:b/>
-                <w:sz w:val="18"/>
-              </w:rPr>
-              <w:t>413.000.000</w:t>
-            </w:r>
-          </w:p>
-        </w:tc>
-      </w:tr>
-      <w:tr>
-        <w:tc>
-          <w:tcPr>
-            <w:tcW w:type="dxa" w:w="1728"/>
-          </w:tcPr>
-          <w:p>
-            <w:r>
-              <w:rPr>
-                <w:rFonts w:ascii="Arial" w:hAnsi="Arial"/>
-                <w:b/>
-                <w:sz w:val="18"/>
+                <w:b w:val="0"/>
+                <w:sz w:val="19"/>
               </w:rPr>
               <w:t>521211</w:t>
             </w:r>
@@ -503,145 +1377,321 @@
         </w:tc>
         <w:tc>
           <w:tcPr>
-            <w:tcW w:type="dxa" w:w="1728"/>
+            <w:tcW w:type="dxa" w:w="3118"/>
+            <w:vAlign w:val="center"/>
+            <w:tcMar>
+              <w:top w:w="75" w:type="dxa"/>
+              <w:bottom w:w="75" w:type="dxa"/>
+              <w:left w:w="110" w:type="dxa"/>
+              <w:right w:w="110" w:type="dxa"/>
+            </w:tcMar>
           </w:tcPr>
           <w:p>
+            <w:pPr>
+              <w:spacing w:before="0" w:after="0" w:line="276" w:lineRule="auto"/>
+              <w:jc w:val="both"/>
+            </w:pPr>
             <w:r>
               <w:rPr>
                 <w:rFonts w:ascii="Arial" w:hAnsi="Arial"/>
-                <w:sz w:val="18"/>
+                <w:b w:val="0"/>
+                <w:sz w:val="19"/>
               </w:rPr>
-              <w:t>Belanja Bahan (ATK, Supplies Komputer, Pelaporan)</w:t>
+              <w:t>Belanja Bahan (ATK, Supplies Komputer, Penggandaan, Pelaporan &amp; Konsumsi Rapat)</w:t>
             </w:r>
           </w:p>
         </w:tc>
         <w:tc>
           <w:tcPr>
-            <w:tcW w:type="dxa" w:w="1728"/>
+            <w:tcW w:type="dxa" w:w="737"/>
+            <w:vAlign w:val="center"/>
+            <w:tcMar>
+              <w:top w:w="75" w:type="dxa"/>
+              <w:bottom w:w="75" w:type="dxa"/>
+              <w:left w:w="110" w:type="dxa"/>
+              <w:right w:w="110" w:type="dxa"/>
+            </w:tcMar>
           </w:tcPr>
           <w:p>
+            <w:pPr>
+              <w:spacing w:before="0" w:after="0" w:line="276" w:lineRule="auto"/>
+              <w:jc w:val="center"/>
+            </w:pPr>
             <w:r>
               <w:rPr>
                 <w:rFonts w:ascii="Arial" w:hAnsi="Arial"/>
-                <w:sz w:val="18"/>
+                <w:b w:val="0"/>
+                <w:sz w:val="19"/>
               </w:rPr>
-              <w:t>1 Paket</w:t>
+              <w:t>1,00</w:t>
             </w:r>
           </w:p>
         </w:tc>
         <w:tc>
           <w:tcPr>
-            <w:tcW w:type="dxa" w:w="1728"/>
+            <w:tcW w:type="dxa" w:w="850"/>
+            <w:vAlign w:val="center"/>
+            <w:tcMar>
+              <w:top w:w="75" w:type="dxa"/>
+              <w:bottom w:w="75" w:type="dxa"/>
+              <w:left w:w="110" w:type="dxa"/>
+              <w:right w:w="110" w:type="dxa"/>
+            </w:tcMar>
           </w:tcPr>
           <w:p>
+            <w:pPr>
+              <w:spacing w:before="0" w:after="0" w:line="276" w:lineRule="auto"/>
+              <w:jc w:val="center"/>
+            </w:pPr>
             <w:r>
               <w:rPr>
                 <w:rFonts w:ascii="Arial" w:hAnsi="Arial"/>
-                <w:sz w:val="18"/>
+                <w:b w:val="0"/>
+                <w:sz w:val="19"/>
               </w:rPr>
+              <w:t>Paket</w:t>
             </w:r>
           </w:p>
         </w:tc>
         <w:tc>
           <w:tcPr>
-            <w:tcW w:type="dxa" w:w="1728"/>
+            <w:tcW w:type="dxa" w:w="1417"/>
+            <w:vAlign w:val="center"/>
+            <w:tcMar>
+              <w:top w:w="75" w:type="dxa"/>
+              <w:bottom w:w="75" w:type="dxa"/>
+              <w:left w:w="110" w:type="dxa"/>
+              <w:right w:w="110" w:type="dxa"/>
+            </w:tcMar>
           </w:tcPr>
           <w:p>
+            <w:pPr>
+              <w:spacing w:before="0" w:after="0" w:line="276" w:lineRule="auto"/>
+              <w:jc w:val="right"/>
+            </w:pPr>
             <w:r>
               <w:rPr>
                 <w:rFonts w:ascii="Arial" w:hAnsi="Arial"/>
-                <w:b/>
-                <w:sz w:val="18"/>
+                <w:b w:val="0"/>
+                <w:sz w:val="19"/>
               </w:rPr>
-              <w:t>44.700.000</w:t>
+              <w:t>45.320.000</w:t>
+            </w:r>
+          </w:p>
+        </w:tc>
+        <w:tc>
+          <w:tcPr>
+            <w:tcW w:type="dxa" w:w="1417"/>
+            <w:vAlign w:val="center"/>
+            <w:tcMar>
+              <w:top w:w="75" w:type="dxa"/>
+              <w:bottom w:w="75" w:type="dxa"/>
+              <w:left w:w="110" w:type="dxa"/>
+              <w:right w:w="110" w:type="dxa"/>
+            </w:tcMar>
+          </w:tcPr>
+          <w:p>
+            <w:pPr>
+              <w:spacing w:before="0" w:after="0" w:line="276" w:lineRule="auto"/>
+              <w:jc w:val="right"/>
+            </w:pPr>
+            <w:r>
+              <w:rPr>
+                <w:rFonts w:ascii="Arial" w:hAnsi="Arial"/>
+                <w:b w:val="0"/>
+                <w:sz w:val="19"/>
+              </w:rPr>
+              <w:t>45.320.000</w:t>
             </w:r>
           </w:p>
         </w:tc>
       </w:tr>
       <w:tr>
+        <w:trPr>
+          <w:cantSplit/>
+        </w:trPr>
         <w:tc>
           <w:tcPr>
-            <w:tcW w:type="dxa" w:w="1728"/>
+            <w:tcW w:type="dxa" w:w="1814"/>
+            <w:vAlign w:val="center"/>
+            <w:tcMar>
+              <w:top w:w="75" w:type="dxa"/>
+              <w:bottom w:w="75" w:type="dxa"/>
+              <w:left w:w="110" w:type="dxa"/>
+              <w:right w:w="110" w:type="dxa"/>
+            </w:tcMar>
           </w:tcPr>
           <w:p>
+            <w:pPr>
+              <w:spacing w:before="0" w:after="0" w:line="276" w:lineRule="auto"/>
+              <w:jc w:val="center"/>
+            </w:pPr>
             <w:r>
               <w:rPr>
                 <w:rFonts w:ascii="Arial" w:hAnsi="Arial"/>
-                <w:b/>
-                <w:sz w:val="18"/>
+                <w:b w:val="0"/>
+                <w:sz w:val="19"/>
               </w:rPr>
-              <w:t>522131</w:t>
+              <w:t>521213</w:t>
             </w:r>
           </w:p>
         </w:tc>
         <w:tc>
           <w:tcPr>
-            <w:tcW w:type="dxa" w:w="1728"/>
+            <w:tcW w:type="dxa" w:w="3118"/>
+            <w:vAlign w:val="center"/>
+            <w:tcMar>
+              <w:top w:w="75" w:type="dxa"/>
+              <w:bottom w:w="75" w:type="dxa"/>
+              <w:left w:w="110" w:type="dxa"/>
+              <w:right w:w="110" w:type="dxa"/>
+            </w:tcMar>
           </w:tcPr>
           <w:p>
+            <w:pPr>
+              <w:spacing w:before="0" w:after="0" w:line="276" w:lineRule="auto"/>
+              <w:jc w:val="both"/>
+            </w:pPr>
             <w:r>
               <w:rPr>
                 <w:rFonts w:ascii="Arial" w:hAnsi="Arial"/>
-                <w:sz w:val="18"/>
+                <w:b w:val="0"/>
+                <w:sz w:val="19"/>
               </w:rPr>
-              <w:t>Belanja Jasa Profesi / Konsultan Individual</w:t>
+              <w:t>Belanja Honor Output Kegiatan (Tim Penyelenggara Kegiatan)</w:t>
             </w:r>
           </w:p>
         </w:tc>
         <w:tc>
           <w:tcPr>
-            <w:tcW w:type="dxa" w:w="1728"/>
+            <w:tcW w:type="dxa" w:w="737"/>
+            <w:vAlign w:val="center"/>
+            <w:tcMar>
+              <w:top w:w="75" w:type="dxa"/>
+              <w:bottom w:w="75" w:type="dxa"/>
+              <w:left w:w="110" w:type="dxa"/>
+              <w:right w:w="110" w:type="dxa"/>
+            </w:tcMar>
           </w:tcPr>
           <w:p>
+            <w:pPr>
+              <w:spacing w:before="0" w:after="0" w:line="276" w:lineRule="auto"/>
+              <w:jc w:val="center"/>
+            </w:pPr>
             <w:r>
               <w:rPr>
                 <w:rFonts w:ascii="Arial" w:hAnsi="Arial"/>
-                <w:sz w:val="18"/>
+                <w:b w:val="0"/>
+                <w:sz w:val="19"/>
               </w:rPr>
-              <w:t>1 Paket</w:t>
+              <w:t>1,00</w:t>
             </w:r>
           </w:p>
         </w:tc>
         <w:tc>
           <w:tcPr>
-            <w:tcW w:type="dxa" w:w="1728"/>
+            <w:tcW w:type="dxa" w:w="850"/>
+            <w:vAlign w:val="center"/>
+            <w:tcMar>
+              <w:top w:w="75" w:type="dxa"/>
+              <w:bottom w:w="75" w:type="dxa"/>
+              <w:left w:w="110" w:type="dxa"/>
+              <w:right w:w="110" w:type="dxa"/>
+            </w:tcMar>
           </w:tcPr>
           <w:p>
+            <w:pPr>
+              <w:spacing w:before="0" w:after="0" w:line="276" w:lineRule="auto"/>
+              <w:jc w:val="center"/>
+            </w:pPr>
             <w:r>
               <w:rPr>
                 <w:rFonts w:ascii="Arial" w:hAnsi="Arial"/>
-                <w:sz w:val="18"/>
+                <w:b w:val="0"/>
+                <w:sz w:val="19"/>
               </w:rPr>
+              <w:t>Paket</w:t>
             </w:r>
           </w:p>
         </w:tc>
         <w:tc>
           <w:tcPr>
-            <w:tcW w:type="dxa" w:w="1728"/>
+            <w:tcW w:type="dxa" w:w="1417"/>
+            <w:vAlign w:val="center"/>
+            <w:tcMar>
+              <w:top w:w="75" w:type="dxa"/>
+              <w:bottom w:w="75" w:type="dxa"/>
+              <w:left w:w="110" w:type="dxa"/>
+              <w:right w:w="110" w:type="dxa"/>
+            </w:tcMar>
           </w:tcPr>
           <w:p>
+            <w:pPr>
+              <w:spacing w:before="0" w:after="0" w:line="276" w:lineRule="auto"/>
+              <w:jc w:val="right"/>
+            </w:pPr>
             <w:r>
               <w:rPr>
                 <w:rFonts w:ascii="Arial" w:hAnsi="Arial"/>
-                <w:b/>
-                <w:sz w:val="18"/>
+                <w:b w:val="0"/>
+                <w:sz w:val="19"/>
               </w:rPr>
-              <w:t>29.400.000</w:t>
+              <w:t>43.200.000</w:t>
+            </w:r>
+          </w:p>
+        </w:tc>
+        <w:tc>
+          <w:tcPr>
+            <w:tcW w:type="dxa" w:w="1417"/>
+            <w:vAlign w:val="center"/>
+            <w:tcMar>
+              <w:top w:w="75" w:type="dxa"/>
+              <w:bottom w:w="75" w:type="dxa"/>
+              <w:left w:w="110" w:type="dxa"/>
+              <w:right w:w="110" w:type="dxa"/>
+            </w:tcMar>
+          </w:tcPr>
+          <w:p>
+            <w:pPr>
+              <w:spacing w:before="0" w:after="0" w:line="276" w:lineRule="auto"/>
+              <w:jc w:val="right"/>
+            </w:pPr>
+            <w:r>
+              <w:rPr>
+                <w:rFonts w:ascii="Arial" w:hAnsi="Arial"/>
+                <w:b w:val="0"/>
+                <w:sz w:val="19"/>
+              </w:rPr>
+              <w:t>43.200.000</w:t>
             </w:r>
           </w:p>
         </w:tc>
       </w:tr>
       <w:tr>
+        <w:trPr>
+          <w:cantSplit/>
+        </w:trPr>
         <w:tc>
           <w:tcPr>
-            <w:tcW w:type="dxa" w:w="1728"/>
+            <w:tcW w:type="dxa" w:w="1814"/>
+            <w:vAlign w:val="center"/>
+            <w:tcMar>
+              <w:top w:w="75" w:type="dxa"/>
+              <w:bottom w:w="75" w:type="dxa"/>
+              <w:left w:w="110" w:type="dxa"/>
+              <w:right w:w="110" w:type="dxa"/>
+            </w:tcMar>
           </w:tcPr>
           <w:p>
+            <w:pPr>
+              <w:spacing w:before="0" w:after="0" w:line="276" w:lineRule="auto"/>
+              <w:jc w:val="center"/>
+            </w:pPr>
             <w:r>
               <w:rPr>
                 <w:rFonts w:ascii="Arial" w:hAnsi="Arial"/>
-                <w:b/>
-                <w:sz w:val="18"/>
+                <w:b w:val="0"/>
+                <w:sz w:val="19"/>
               </w:rPr>
               <w:t>524111</w:t>
             </w:r>
@@ -649,72 +1699,160 @@
         </w:tc>
         <w:tc>
           <w:tcPr>
-            <w:tcW w:type="dxa" w:w="1728"/>
+            <w:tcW w:type="dxa" w:w="3118"/>
+            <w:vAlign w:val="center"/>
+            <w:tcMar>
+              <w:top w:w="75" w:type="dxa"/>
+              <w:bottom w:w="75" w:type="dxa"/>
+              <w:left w:w="110" w:type="dxa"/>
+              <w:right w:w="110" w:type="dxa"/>
+            </w:tcMar>
           </w:tcPr>
           <w:p>
+            <w:pPr>
+              <w:spacing w:before="0" w:after="0" w:line="276" w:lineRule="auto"/>
+              <w:jc w:val="both"/>
+            </w:pPr>
             <w:r>
               <w:rPr>
                 <w:rFonts w:ascii="Arial" w:hAnsi="Arial"/>
-                <w:sz w:val="18"/>
+                <w:b w:val="0"/>
+                <w:sz w:val="19"/>
               </w:rPr>
-              <w:t>Belanja Perjalanan Dinas Biasa (Monitoring Wilayah &amp; Pusat)</w:t>
+              <w:t>Belanja Perjalanan Dinas Biasa (Koordinasi, Survei, Pendampingan &amp; Monev Luar Kota)</w:t>
             </w:r>
           </w:p>
         </w:tc>
         <w:tc>
           <w:tcPr>
-            <w:tcW w:type="dxa" w:w="1728"/>
+            <w:tcW w:type="dxa" w:w="737"/>
+            <w:vAlign w:val="center"/>
+            <w:tcMar>
+              <w:top w:w="75" w:type="dxa"/>
+              <w:bottom w:w="75" w:type="dxa"/>
+              <w:left w:w="110" w:type="dxa"/>
+              <w:right w:w="110" w:type="dxa"/>
+            </w:tcMar>
           </w:tcPr>
           <w:p>
+            <w:pPr>
+              <w:spacing w:before="0" w:after="0" w:line="276" w:lineRule="auto"/>
+              <w:jc w:val="center"/>
+            </w:pPr>
             <w:r>
               <w:rPr>
                 <w:rFonts w:ascii="Arial" w:hAnsi="Arial"/>
-                <w:sz w:val="18"/>
+                <w:b w:val="0"/>
+                <w:sz w:val="19"/>
               </w:rPr>
-              <w:t>1 Paket</w:t>
+              <w:t>1,00</w:t>
             </w:r>
           </w:p>
         </w:tc>
         <w:tc>
           <w:tcPr>
-            <w:tcW w:type="dxa" w:w="1728"/>
+            <w:tcW w:type="dxa" w:w="850"/>
+            <w:vAlign w:val="center"/>
+            <w:tcMar>
+              <w:top w:w="75" w:type="dxa"/>
+              <w:bottom w:w="75" w:type="dxa"/>
+              <w:left w:w="110" w:type="dxa"/>
+              <w:right w:w="110" w:type="dxa"/>
+            </w:tcMar>
           </w:tcPr>
           <w:p>
+            <w:pPr>
+              <w:spacing w:before="0" w:after="0" w:line="276" w:lineRule="auto"/>
+              <w:jc w:val="center"/>
+            </w:pPr>
             <w:r>
               <w:rPr>
                 <w:rFonts w:ascii="Arial" w:hAnsi="Arial"/>
-                <w:sz w:val="18"/>
+                <w:b w:val="0"/>
+                <w:sz w:val="19"/>
               </w:rPr>
+              <w:t>Paket</w:t>
             </w:r>
           </w:p>
         </w:tc>
         <w:tc>
           <w:tcPr>
-            <w:tcW w:type="dxa" w:w="1728"/>
+            <w:tcW w:type="dxa" w:w="1417"/>
+            <w:vAlign w:val="center"/>
+            <w:tcMar>
+              <w:top w:w="75" w:type="dxa"/>
+              <w:bottom w:w="75" w:type="dxa"/>
+              <w:left w:w="110" w:type="dxa"/>
+              <w:right w:w="110" w:type="dxa"/>
+            </w:tcMar>
           </w:tcPr>
           <w:p>
+            <w:pPr>
+              <w:spacing w:before="0" w:after="0" w:line="276" w:lineRule="auto"/>
+              <w:jc w:val="right"/>
+            </w:pPr>
             <w:r>
               <w:rPr>
                 <w:rFonts w:ascii="Arial" w:hAnsi="Arial"/>
-                <w:b/>
-                <w:sz w:val="18"/>
+                <w:b w:val="0"/>
+                <w:sz w:val="19"/>
               </w:rPr>
-              <w:t>326.900.000</w:t>
+              <w:t>225.730.000</w:t>
+            </w:r>
+          </w:p>
+        </w:tc>
+        <w:tc>
+          <w:tcPr>
+            <w:tcW w:type="dxa" w:w="1417"/>
+            <w:vAlign w:val="center"/>
+            <w:tcMar>
+              <w:top w:w="75" w:type="dxa"/>
+              <w:bottom w:w="75" w:type="dxa"/>
+              <w:left w:w="110" w:type="dxa"/>
+              <w:right w:w="110" w:type="dxa"/>
+            </w:tcMar>
+          </w:tcPr>
+          <w:p>
+            <w:pPr>
+              <w:spacing w:before="0" w:after="0" w:line="276" w:lineRule="auto"/>
+              <w:jc w:val="right"/>
+            </w:pPr>
+            <w:r>
+              <w:rPr>
+                <w:rFonts w:ascii="Arial" w:hAnsi="Arial"/>
+                <w:b w:val="0"/>
+                <w:sz w:val="19"/>
+              </w:rPr>
+              <w:t>225.730.000</w:t>
             </w:r>
           </w:p>
         </w:tc>
       </w:tr>
       <w:tr>
+        <w:trPr>
+          <w:cantSplit/>
+        </w:trPr>
         <w:tc>
           <w:tcPr>
-            <w:tcW w:type="dxa" w:w="1728"/>
+            <w:tcW w:type="dxa" w:w="1814"/>
+            <w:vAlign w:val="center"/>
+            <w:tcMar>
+              <w:top w:w="75" w:type="dxa"/>
+              <w:bottom w:w="75" w:type="dxa"/>
+              <w:left w:w="110" w:type="dxa"/>
+              <w:right w:w="110" w:type="dxa"/>
+            </w:tcMar>
           </w:tcPr>
           <w:p>
+            <w:pPr>
+              <w:spacing w:before="0" w:after="0" w:line="276" w:lineRule="auto"/>
+              <w:jc w:val="center"/>
+            </w:pPr>
             <w:r>
               <w:rPr>
                 <w:rFonts w:ascii="Arial" w:hAnsi="Arial"/>
-                <w:b/>
-                <w:sz w:val="18"/>
+                <w:b w:val="0"/>
+                <w:sz w:val="19"/>
               </w:rPr>
               <w:t>524113</w:t>
             </w:r>
@@ -722,57 +1860,456 @@
         </w:tc>
         <w:tc>
           <w:tcPr>
-            <w:tcW w:type="dxa" w:w="1728"/>
+            <w:tcW w:type="dxa" w:w="3118"/>
+            <w:vAlign w:val="center"/>
+            <w:tcMar>
+              <w:top w:w="75" w:type="dxa"/>
+              <w:bottom w:w="75" w:type="dxa"/>
+              <w:left w:w="110" w:type="dxa"/>
+              <w:right w:w="110" w:type="dxa"/>
+            </w:tcMar>
           </w:tcPr>
           <w:p>
+            <w:pPr>
+              <w:spacing w:before="0" w:after="0" w:line="276" w:lineRule="auto"/>
+              <w:jc w:val="both"/>
+            </w:pPr>
             <w:r>
               <w:rPr>
                 <w:rFonts w:ascii="Arial" w:hAnsi="Arial"/>
-                <w:sz w:val="18"/>
+                <w:b w:val="0"/>
+                <w:sz w:val="19"/>
               </w:rPr>
-              <w:t>Belanja Perjalanan Dinas Dalam Kota (Tim PPK)</w:t>
+              <w:t>Belanja Perjalanan Dinas Dalam Kota (Survei &amp; Monitoring Pekanbaru)</w:t>
             </w:r>
           </w:p>
         </w:tc>
         <w:tc>
           <w:tcPr>
-            <w:tcW w:type="dxa" w:w="1728"/>
+            <w:tcW w:type="dxa" w:w="737"/>
+            <w:vAlign w:val="center"/>
+            <w:tcMar>
+              <w:top w:w="75" w:type="dxa"/>
+              <w:bottom w:w="75" w:type="dxa"/>
+              <w:left w:w="110" w:type="dxa"/>
+              <w:right w:w="110" w:type="dxa"/>
+            </w:tcMar>
           </w:tcPr>
           <w:p>
+            <w:pPr>
+              <w:spacing w:before="0" w:after="0" w:line="276" w:lineRule="auto"/>
+              <w:jc w:val="center"/>
+            </w:pPr>
             <w:r>
               <w:rPr>
                 <w:rFonts w:ascii="Arial" w:hAnsi="Arial"/>
-                <w:sz w:val="18"/>
+                <w:b w:val="0"/>
+                <w:sz w:val="19"/>
               </w:rPr>
-              <w:t>1 Paket</w:t>
+              <w:t>1,00</w:t>
             </w:r>
           </w:p>
         </w:tc>
         <w:tc>
           <w:tcPr>
-            <w:tcW w:type="dxa" w:w="1728"/>
+            <w:tcW w:type="dxa" w:w="850"/>
+            <w:vAlign w:val="center"/>
+            <w:tcMar>
+              <w:top w:w="75" w:type="dxa"/>
+              <w:bottom w:w="75" w:type="dxa"/>
+              <w:left w:w="110" w:type="dxa"/>
+              <w:right w:w="110" w:type="dxa"/>
+            </w:tcMar>
           </w:tcPr>
           <w:p>
+            <w:pPr>
+              <w:spacing w:before="0" w:after="0" w:line="276" w:lineRule="auto"/>
+              <w:jc w:val="center"/>
+            </w:pPr>
             <w:r>
               <w:rPr>
                 <w:rFonts w:ascii="Arial" w:hAnsi="Arial"/>
-                <w:sz w:val="18"/>
+                <w:b w:val="0"/>
+                <w:sz w:val="19"/>
+              </w:rPr>
+              <w:t>Paket</w:t>
+            </w:r>
+          </w:p>
+        </w:tc>
+        <w:tc>
+          <w:tcPr>
+            <w:tcW w:type="dxa" w:w="1417"/>
+            <w:vAlign w:val="center"/>
+            <w:tcMar>
+              <w:top w:w="75" w:type="dxa"/>
+              <w:bottom w:w="75" w:type="dxa"/>
+              <w:left w:w="110" w:type="dxa"/>
+              <w:right w:w="110" w:type="dxa"/>
+            </w:tcMar>
+          </w:tcPr>
+          <w:p>
+            <w:pPr>
+              <w:spacing w:before="0" w:after="0" w:line="276" w:lineRule="auto"/>
+              <w:jc w:val="right"/>
+            </w:pPr>
+            <w:r>
+              <w:rPr>
+                <w:rFonts w:ascii="Arial" w:hAnsi="Arial"/>
+                <w:b w:val="0"/>
+                <w:sz w:val="19"/>
+              </w:rPr>
+              <w:t>9.750.000</w:t>
+            </w:r>
+          </w:p>
+        </w:tc>
+        <w:tc>
+          <w:tcPr>
+            <w:tcW w:type="dxa" w:w="1417"/>
+            <w:vAlign w:val="center"/>
+            <w:tcMar>
+              <w:top w:w="75" w:type="dxa"/>
+              <w:bottom w:w="75" w:type="dxa"/>
+              <w:left w:w="110" w:type="dxa"/>
+              <w:right w:w="110" w:type="dxa"/>
+            </w:tcMar>
+          </w:tcPr>
+          <w:p>
+            <w:pPr>
+              <w:spacing w:before="0" w:after="0" w:line="276" w:lineRule="auto"/>
+              <w:jc w:val="right"/>
+            </w:pPr>
+            <w:r>
+              <w:rPr>
+                <w:rFonts w:ascii="Arial" w:hAnsi="Arial"/>
+                <w:b w:val="0"/>
+                <w:sz w:val="19"/>
+              </w:rPr>
+              <w:t>9.750.000</w:t>
+            </w:r>
+          </w:p>
+        </w:tc>
+      </w:tr>
+      <w:tr>
+        <w:trPr>
+          <w:cantSplit/>
+        </w:trPr>
+        <w:tc>
+          <w:tcPr>
+            <w:tcW w:type="dxa" w:w="1814"/>
+            <w:vAlign w:val="center"/>
+            <w:tcMar>
+              <w:top w:w="75" w:type="dxa"/>
+              <w:bottom w:w="75" w:type="dxa"/>
+              <w:left w:w="110" w:type="dxa"/>
+              <w:right w:w="110" w:type="dxa"/>
+            </w:tcMar>
+          </w:tcPr>
+          <w:p>
+            <w:pPr>
+              <w:spacing w:before="0" w:after="0" w:line="276" w:lineRule="auto"/>
+              <w:jc w:val="center"/>
+            </w:pPr>
+            <w:r>
+              <w:rPr>
+                <w:rFonts w:ascii="Arial" w:hAnsi="Arial"/>
+                <w:b w:val="0"/>
+                <w:sz w:val="19"/>
+              </w:rPr>
+              <w:t>524114</w:t>
+            </w:r>
+          </w:p>
+        </w:tc>
+        <w:tc>
+          <w:tcPr>
+            <w:tcW w:type="dxa" w:w="3118"/>
+            <w:vAlign w:val="center"/>
+            <w:tcMar>
+              <w:top w:w="75" w:type="dxa"/>
+              <w:bottom w:w="75" w:type="dxa"/>
+              <w:left w:w="110" w:type="dxa"/>
+              <w:right w:w="110" w:type="dxa"/>
+            </w:tcMar>
+          </w:tcPr>
+          <w:p>
+            <w:pPr>
+              <w:spacing w:before="0" w:after="0" w:line="276" w:lineRule="auto"/>
+              <w:jc w:val="both"/>
+            </w:pPr>
+            <w:r>
+              <w:rPr>
+                <w:rFonts w:ascii="Arial" w:hAnsi="Arial"/>
+                <w:b w:val="0"/>
+                <w:sz w:val="19"/>
+              </w:rPr>
+              <w:t>Belanja Perjalanan Dinas Paket Meeting Dalam Kota (Fullday/Fullboard)</w:t>
+            </w:r>
+          </w:p>
+        </w:tc>
+        <w:tc>
+          <w:tcPr>
+            <w:tcW w:type="dxa" w:w="737"/>
+            <w:vAlign w:val="center"/>
+            <w:tcMar>
+              <w:top w:w="75" w:type="dxa"/>
+              <w:bottom w:w="75" w:type="dxa"/>
+              <w:left w:w="110" w:type="dxa"/>
+              <w:right w:w="110" w:type="dxa"/>
+            </w:tcMar>
+          </w:tcPr>
+          <w:p>
+            <w:pPr>
+              <w:spacing w:before="0" w:after="0" w:line="276" w:lineRule="auto"/>
+              <w:jc w:val="center"/>
+            </w:pPr>
+            <w:r>
+              <w:rPr>
+                <w:rFonts w:ascii="Arial" w:hAnsi="Arial"/>
+                <w:b w:val="0"/>
+                <w:sz w:val="19"/>
+              </w:rPr>
+              <w:t>1,00</w:t>
+            </w:r>
+          </w:p>
+        </w:tc>
+        <w:tc>
+          <w:tcPr>
+            <w:tcW w:type="dxa" w:w="850"/>
+            <w:vAlign w:val="center"/>
+            <w:tcMar>
+              <w:top w:w="75" w:type="dxa"/>
+              <w:bottom w:w="75" w:type="dxa"/>
+              <w:left w:w="110" w:type="dxa"/>
+              <w:right w:w="110" w:type="dxa"/>
+            </w:tcMar>
+          </w:tcPr>
+          <w:p>
+            <w:pPr>
+              <w:spacing w:before="0" w:after="0" w:line="276" w:lineRule="auto"/>
+              <w:jc w:val="center"/>
+            </w:pPr>
+            <w:r>
+              <w:rPr>
+                <w:rFonts w:ascii="Arial" w:hAnsi="Arial"/>
+                <w:b w:val="0"/>
+                <w:sz w:val="19"/>
+              </w:rPr>
+              <w:t>Paket</w:t>
+            </w:r>
+          </w:p>
+        </w:tc>
+        <w:tc>
+          <w:tcPr>
+            <w:tcW w:type="dxa" w:w="1417"/>
+            <w:vAlign w:val="center"/>
+            <w:tcMar>
+              <w:top w:w="75" w:type="dxa"/>
+              <w:bottom w:w="75" w:type="dxa"/>
+              <w:left w:w="110" w:type="dxa"/>
+              <w:right w:w="110" w:type="dxa"/>
+            </w:tcMar>
+          </w:tcPr>
+          <w:p>
+            <w:pPr>
+              <w:spacing w:before="0" w:after="0" w:line="276" w:lineRule="auto"/>
+              <w:jc w:val="right"/>
+            </w:pPr>
+            <w:r>
+              <w:rPr>
+                <w:rFonts w:ascii="Arial" w:hAnsi="Arial"/>
+                <w:b w:val="0"/>
+                <w:sz w:val="19"/>
+              </w:rPr>
+              <w:t>89.000.000</w:t>
+            </w:r>
+          </w:p>
+        </w:tc>
+        <w:tc>
+          <w:tcPr>
+            <w:tcW w:type="dxa" w:w="1417"/>
+            <w:vAlign w:val="center"/>
+            <w:tcMar>
+              <w:top w:w="75" w:type="dxa"/>
+              <w:bottom w:w="75" w:type="dxa"/>
+              <w:left w:w="110" w:type="dxa"/>
+              <w:right w:w="110" w:type="dxa"/>
+            </w:tcMar>
+          </w:tcPr>
+          <w:p>
+            <w:pPr>
+              <w:spacing w:before="0" w:after="0" w:line="276" w:lineRule="auto"/>
+              <w:jc w:val="right"/>
+            </w:pPr>
+            <w:r>
+              <w:rPr>
+                <w:rFonts w:ascii="Arial" w:hAnsi="Arial"/>
+                <w:b w:val="0"/>
+                <w:sz w:val="19"/>
+              </w:rPr>
+              <w:t>89.000.000</w:t>
+            </w:r>
+          </w:p>
+        </w:tc>
+      </w:tr>
+      <w:tr>
+        <w:trPr>
+          <w:cantSplit/>
+        </w:trPr>
+        <w:tc>
+          <w:tcPr>
+            <w:tcW w:type="dxa" w:w="1814"/>
+            <w:vAlign w:val="center"/>
+            <w:shd w:fill="F2F4F8"/>
+            <w:tcMar>
+              <w:top w:w="75" w:type="dxa"/>
+              <w:bottom w:w="75" w:type="dxa"/>
+              <w:left w:w="110" w:type="dxa"/>
+              <w:right w:w="110" w:type="dxa"/>
+            </w:tcMar>
+          </w:tcPr>
+          <w:p>
+            <w:pPr>
+              <w:spacing w:before="0" w:after="0" w:line="276" w:lineRule="auto"/>
+              <w:jc w:val="center"/>
+            </w:pPr>
+            <w:r>
+              <w:rPr>
+                <w:rFonts w:ascii="Arial" w:hAnsi="Arial"/>
+                <w:b/>
+                <w:sz w:val="19"/>
+              </w:rPr>
+              <w:t>TOTAL</w:t>
+            </w:r>
+          </w:p>
+        </w:tc>
+        <w:tc>
+          <w:tcPr>
+            <w:tcW w:type="dxa" w:w="3118"/>
+            <w:vAlign w:val="center"/>
+            <w:shd w:fill="F2F4F8"/>
+            <w:tcMar>
+              <w:top w:w="75" w:type="dxa"/>
+              <w:bottom w:w="75" w:type="dxa"/>
+              <w:left w:w="110" w:type="dxa"/>
+              <w:right w:w="110" w:type="dxa"/>
+            </w:tcMar>
+          </w:tcPr>
+          <w:p>
+            <w:pPr>
+              <w:spacing w:before="0" w:after="0" w:line="276" w:lineRule="auto"/>
+              <w:jc w:val="left"/>
+            </w:pPr>
+            <w:r>
+              <w:rPr>
+                <w:rFonts w:ascii="Arial" w:hAnsi="Arial"/>
+                <w:b/>
+                <w:sz w:val="19"/>
+              </w:rPr>
+              <w:t>JUMLAH PAGU ANGGARAN SWAKELOLA SPPG TA 2025</w:t>
+            </w:r>
+          </w:p>
+        </w:tc>
+        <w:tc>
+          <w:tcPr>
+            <w:tcW w:type="dxa" w:w="737"/>
+            <w:vAlign w:val="center"/>
+            <w:shd w:fill="F2F4F8"/>
+            <w:tcMar>
+              <w:top w:w="75" w:type="dxa"/>
+              <w:bottom w:w="75" w:type="dxa"/>
+              <w:left w:w="110" w:type="dxa"/>
+              <w:right w:w="110" w:type="dxa"/>
+            </w:tcMar>
+          </w:tcPr>
+          <w:p>
+            <w:pPr>
+              <w:spacing w:before="0" w:after="0" w:line="276" w:lineRule="auto"/>
+              <w:jc w:val="center"/>
+            </w:pPr>
+            <w:r>
+              <w:rPr>
+                <w:rFonts w:ascii="Arial" w:hAnsi="Arial"/>
+                <w:b/>
+                <w:sz w:val="19"/>
               </w:rPr>
             </w:r>
           </w:p>
         </w:tc>
         <w:tc>
           <w:tcPr>
-            <w:tcW w:type="dxa" w:w="1728"/>
+            <w:tcW w:type="dxa" w:w="850"/>
+            <w:vAlign w:val="center"/>
+            <w:shd w:fill="F2F4F8"/>
+            <w:tcMar>
+              <w:top w:w="75" w:type="dxa"/>
+              <w:bottom w:w="75" w:type="dxa"/>
+              <w:left w:w="110" w:type="dxa"/>
+              <w:right w:w="110" w:type="dxa"/>
+            </w:tcMar>
           </w:tcPr>
           <w:p>
+            <w:pPr>
+              <w:spacing w:before="0" w:after="0" w:line="276" w:lineRule="auto"/>
+              <w:jc w:val="center"/>
+            </w:pPr>
             <w:r>
               <w:rPr>
                 <w:rFonts w:ascii="Arial" w:hAnsi="Arial"/>
                 <w:b/>
-                <w:sz w:val="18"/>
+                <w:sz w:val="19"/>
               </w:rPr>
-              <w:t>12.000.000</w:t>
+            </w:r>
+          </w:p>
+        </w:tc>
+        <w:tc>
+          <w:tcPr>
+            <w:tcW w:type="dxa" w:w="1417"/>
+            <w:vAlign w:val="center"/>
+            <w:shd w:fill="F2F4F8"/>
+            <w:tcMar>
+              <w:top w:w="75" w:type="dxa"/>
+              <w:bottom w:w="75" w:type="dxa"/>
+              <w:left w:w="110" w:type="dxa"/>
+              <w:right w:w="110" w:type="dxa"/>
+            </w:tcMar>
+          </w:tcPr>
+          <w:p>
+            <w:pPr>
+              <w:spacing w:before="0" w:after="0" w:line="276" w:lineRule="auto"/>
+              <w:jc w:val="center"/>
+            </w:pPr>
+            <w:r>
+              <w:rPr>
+                <w:rFonts w:ascii="Arial" w:hAnsi="Arial"/>
+                <w:b/>
+                <w:sz w:val="19"/>
+              </w:rPr>
+            </w:r>
+          </w:p>
+        </w:tc>
+        <w:tc>
+          <w:tcPr>
+            <w:tcW w:type="dxa" w:w="1417"/>
+            <w:vAlign w:val="center"/>
+            <w:shd w:fill="F2F4F8"/>
+            <w:tcMar>
+              <w:top w:w="75" w:type="dxa"/>
+              <w:bottom w:w="75" w:type="dxa"/>
+              <w:left w:w="110" w:type="dxa"/>
+              <w:right w:w="110" w:type="dxa"/>
+            </w:tcMar>
+          </w:tcPr>
+          <w:p>
+            <w:pPr>
+              <w:spacing w:before="0" w:after="0" w:line="276" w:lineRule="auto"/>
+              <w:jc w:val="right"/>
+            </w:pPr>
+            <w:r>
+              <w:rPr>
+                <w:rFonts w:ascii="Arial" w:hAnsi="Arial"/>
+                <w:b/>
+                <w:sz w:val="19"/>
+              </w:rPr>
+              <w:t>413.000.000</w:t>
             </w:r>
           </w:p>
         </w:tc>
@@ -780,114 +2317,98 @@
     </w:tbl>
     <w:p>
       <w:pPr>
-        <w:spacing w:before="280" w:after="80"/>
-        <w:jc w:val="right"/>
+        <w:spacing w:before="0" w:after="120"/>
+      </w:pPr>
+    </w:p>
+    <w:p>
+      <w:pPr>
+        <w:spacing w:before="0" w:after="120" w:line="300" w:lineRule="auto"/>
+        <w:jc w:val="both"/>
       </w:pPr>
       <w:r>
         <w:rPr>
           <w:rFonts w:ascii="Arial" w:hAnsi="Arial"/>
-          <w:sz w:val="20"/>
+          <w:b w:val="0"/>
+          <w:sz w:val="21"/>
         </w:rPr>
-        <w:t>Pekanbaru, 22 September 2025</w:t>
+        <w:t>Catatan Verifikasi: Petikan rincian POK ini disusun sesuai dengan dokumen Kerangka Acuan Kerja (KAK) dan Rencana Anggaran Biaya (RAB) resmi Kegiatan Administrasi Pembangunan Gedung SPPG Provinsi Riau Tahun Anggaran 2025.</w:t>
       </w:r>
     </w:p>
     <w:tbl>
       <w:tblPr>
         <w:tblW w:type="auto" w:w="0"/>
         <w:jc w:val="center"/>
+        <w:tblLayout w:type="fixed"/>
         <w:tblLook w:firstColumn="1" w:firstRow="1" w:lastColumn="0" w:lastRow="0" w:noHBand="0" w:noVBand="1" w:val="04A0"/>
+        <w:tblBorders>
+          <w:top w:val="none" w:sz="0" w:space="0" w:color="auto"/>
+          <w:left w:val="none" w:sz="0" w:space="0" w:color="auto"/>
+          <w:bottom w:val="none" w:sz="0" w:space="0" w:color="auto"/>
+          <w:right w:val="none" w:sz="0" w:space="0" w:color="auto"/>
+          <w:insideH w:val="none" w:sz="0" w:space="0" w:color="auto"/>
+          <w:insideV w:val="none" w:sz="0" w:space="0" w:color="auto"/>
+        </w:tblBorders>
       </w:tblPr>
       <w:tblGrid>
-        <w:gridCol w:w="4608"/>
-        <w:gridCol w:w="4608"/>
+        <w:gridCol w:w="4677"/>
+        <w:gridCol w:w="4677"/>
       </w:tblGrid>
       <w:tr>
+        <w:trPr>
+          <w:cantSplit/>
+        </w:trPr>
         <w:tc>
           <w:tcPr>
-            <w:tcW w:type="dxa" w:w="4320"/>
+            <w:tcW w:type="dxa" w:w="4819"/>
+          </w:tcPr>
+          <w:p/>
+        </w:tc>
+        <w:tc>
+          <w:tcPr>
+            <w:tcW w:type="dxa" w:w="4535"/>
           </w:tcPr>
           <w:p>
             <w:pPr>
-              <w:jc w:val="center"/>
+              <w:spacing w:before="160" w:after="0" w:line="276" w:lineRule="auto"/>
+              <w:jc w:val="left"/>
             </w:pPr>
             <w:r>
               <w:rPr>
                 <w:rFonts w:ascii="Arial" w:hAnsi="Arial"/>
-                <w:b/>
-                <w:sz w:val="20"/>
+                <w:sz w:val="21"/>
               </w:rPr>
-              <w:t>Pejabat Pembuat Komitmen</w:t>
+              <w:t>Pekanbaru, 22 September 2025</w:t>
               <w:br/>
-              <w:t>Pelaksanaan Prasarana Strategis</w:t>
             </w:r>
-          </w:p>
-        </w:tc>
-        <w:tc>
-          <w:tcPr>
-            <w:tcW w:type="dxa" w:w="4320"/>
-          </w:tcPr>
-          <w:p>
-            <w:pPr>
-              <w:jc w:val="center"/>
-            </w:pPr>
             <w:r>
               <w:rPr>
                 <w:rFonts w:ascii="Arial" w:hAnsi="Arial"/>
                 <w:b/>
-                <w:sz w:val="20"/>
+                <w:sz w:val="21"/>
               </w:rPr>
-              <w:t>Kepala Satuan Kerja</w:t>
+              <w:t>Kuasa Pengguna Anggaran / Kepala Satuan Kerja</w:t>
               <w:br/>
-              <w:t>Pelaksanaan Prasarana Strategis Riau</w:t>
+              <w:t>Pelaksanaan Prasarana Strategis Riau,</w:t>
+              <w:br/>
+              <w:br/>
+              <w:br/>
+              <w:br/>
             </w:r>
-          </w:p>
-        </w:tc>
-      </w:tr>
-      <w:tr>
-        <w:tc>
-          <w:tcPr>
-            <w:tcW w:type="dxa" w:w="4320"/>
-          </w:tcPr>
-          <w:p>
-            <w:pPr>
-              <w:jc w:val="center"/>
-            </w:pPr>
             <w:r>
               <w:rPr>
                 <w:rFonts w:ascii="Arial" w:hAnsi="Arial"/>
                 <w:b/>
-                <w:sz w:val="20"/>
+                <w:sz w:val="21"/>
+                <w:u w:val="single"/>
               </w:rPr>
+              <w:t>Muhammad Yudi Prasetya, S.T.</w:t>
               <w:br/>
-              <w:br/>
-              <w:br/>
-              <w:br/>
-              <w:t>Nurhidayat Nugroho, S.Ars.</w:t>
-              <w:br/>
-              <w:t>NIP. 19901221 201802 1 001</w:t>
             </w:r>
-          </w:p>
-        </w:tc>
-        <w:tc>
-          <w:tcPr>
-            <w:tcW w:type="dxa" w:w="4320"/>
-          </w:tcPr>
-          <w:p>
-            <w:pPr>
-              <w:jc w:val="center"/>
-            </w:pPr>
             <w:r>
               <w:rPr>
                 <w:rFonts w:ascii="Arial" w:hAnsi="Arial"/>
-                <w:b/>
-                <w:sz w:val="20"/>
+                <w:sz w:val="21"/>
               </w:rPr>
-              <w:br/>
-              <w:br/>
-              <w:br/>
-              <w:br/>
-              <w:t>Muhammad Yudi Prasetya, S.T.</w:t>
-              <w:br/>
               <w:t>NIP. 19800214 201412 1 002</w:t>
             </w:r>
           </w:p>
@@ -895,8 +2416,8 @@
       </w:tr>
     </w:tbl>
     <w:sectPr>
-      <w:pgSz w:w="12240" w:h="15840"/>
-      <w:pgMar w:top="1440" w:right="1800" w:bottom="1440" w:left="1800" w:header="720" w:footer="720" w:gutter="0"/>
+      <w:pgSz w:w="11906" w:h="16838"/>
+      <w:pgMar w:top="1020" w:right="1276" w:bottom="1134" w:left="1276" w:header="720" w:footer="720" w:gutter="0"/>
       <w:cols w:space="720"/>
       <w:docGrid w:linePitch="360"/>
     </w:sectPr>
@@ -1267,6 +2788,14 @@
     <w:name w:val="Normal"/>
     <w:qFormat/>
     <w:rsid w:val="00FC693F"/>
+    <w:pPr>
+      <w:spacing w:line="288" w:lineRule="auto" w:after="80"/>
+    </w:pPr>
+    <w:rPr>
+      <w:rFonts w:ascii="Arial" w:hAnsi="Arial"/>
+      <w:color w:val="000000"/>
+      <w:sz w:val="21"/>
+    </w:rPr>
   </w:style>
   <w:style w:type="paragraph" w:styleId="Header">
     <w:name w:val="header"/>

</xml_diff>